<commit_message>
Rev 5: HK ageing-population writing task with three model paragraphs; formatting preserved from Helen's file
</commit_message>
<xml_diff>
--- a/6B Grammar Lesson 3 - Discussing Solutions (Students).docx
+++ b/6B Grammar Lesson 3 - Discussing Solutions (Students).docx
@@ -454,9 +454,7 @@
           <w:tcPr>
             <w:tcW w:type="dxa" w:w="9071"/>
           </w:tcPr>
-          <w:p>
-            <w:r/>
-          </w:p>
+          <w:p/>
           <w:p/>
         </w:tc>
       </w:tr>
@@ -478,9 +476,7 @@
           <w:tcPr>
             <w:tcW w:type="dxa" w:w="9071"/>
           </w:tcPr>
-          <w:p>
-            <w:r/>
-          </w:p>
+          <w:p/>
           <w:p/>
         </w:tc>
       </w:tr>
@@ -502,9 +498,7 @@
           <w:tcPr>
             <w:tcW w:type="dxa" w:w="9071"/>
           </w:tcPr>
-          <w:p>
-            <w:r/>
-          </w:p>
+          <w:p/>
           <w:p/>
         </w:tc>
       </w:tr>
@@ -526,9 +520,7 @@
           <w:tcPr>
             <w:tcW w:type="dxa" w:w="9071"/>
           </w:tcPr>
-          <w:p>
-            <w:r/>
-          </w:p>
+          <w:p/>
           <w:p/>
         </w:tc>
       </w:tr>
@@ -550,9 +542,7 @@
           <w:tcPr>
             <w:tcW w:type="dxa" w:w="9071"/>
           </w:tcPr>
-          <w:p>
-            <w:r/>
-          </w:p>
+          <w:p/>
           <w:p/>
         </w:tc>
       </w:tr>
@@ -574,9 +564,7 @@
           <w:tcPr>
             <w:tcW w:type="dxa" w:w="9071"/>
           </w:tcPr>
-          <w:p>
-            <w:r/>
-          </w:p>
+          <w:p/>
           <w:p/>
         </w:tc>
       </w:tr>
@@ -598,9 +586,7 @@
           <w:tcPr>
             <w:tcW w:type="dxa" w:w="9071"/>
           </w:tcPr>
-          <w:p>
-            <w:r/>
-          </w:p>
+          <w:p/>
           <w:p/>
         </w:tc>
       </w:tr>
@@ -622,9 +608,7 @@
           <w:tcPr>
             <w:tcW w:type="dxa" w:w="9071"/>
           </w:tcPr>
-          <w:p>
-            <w:r/>
-          </w:p>
+          <w:p/>
           <w:p/>
         </w:tc>
       </w:tr>
@@ -646,9 +630,7 @@
           <w:tcPr>
             <w:tcW w:type="dxa" w:w="9071"/>
           </w:tcPr>
-          <w:p>
-            <w:r/>
-          </w:p>
+          <w:p/>
           <w:p/>
         </w:tc>
       </w:tr>
@@ -670,9 +652,7 @@
           <w:tcPr>
             <w:tcW w:type="dxa" w:w="9071"/>
           </w:tcPr>
-          <w:p>
-            <w:r/>
-          </w:p>
+          <w:p/>
           <w:p/>
         </w:tc>
       </w:tr>
@@ -1993,7 +1973,10 @@
           </w:p>
           <w:p>
             <w:r>
-              <w:t>You are a Form 6 student. Your school is considering cutting one of the two weekly PE lessons so that F.6 students can have an extra period for examination preparation. Write a letter to the Principal expressing your opinion on this idea.</w:t>
+              <w:rPr>
+                <w:b w:val="0"/>
+              </w:rPr>
+              <w:t>You are a Form 6 student. Hong Kong’s population is ageing rapidly, and the needs of elderly citizens have become a pressing social issue. Write a letter to the editor of the Hong Kong Young Post, suggesting THREE ways in which our city can care for its growing number of elderly citizens.</w:t>
             </w:r>
           </w:p>
         </w:tc>
@@ -2016,7 +1999,10 @@
         <w:ind w:left="227"/>
       </w:pPr>
       <w:r>
-        <w:t>Write ONE body paragraph (about 120 words) for this letter — not the whole letter.</w:t>
+        <w:rPr>
+          <w:b w:val="0"/>
+        </w:rPr>
+        <w:t>Write THREE body paragraphs (about 100 words each) for this letter.</w:t>
       </w:r>
     </w:p>
     <w:p>
@@ -2025,7 +2011,10 @@
         <w:ind w:left="227"/>
       </w:pPr>
       <w:r>
-        <w:t>State your view on the proposal, give at least one reason and at least one suggestion.</w:t>
+        <w:rPr>
+          <w:b w:val="0"/>
+        </w:rPr>
+        <w:t>Begin each paragraph with a topic sentence that makes ONE suggestion, using a different pattern from today’s lesson in each paragraph.</w:t>
       </w:r>
     </w:p>
     <w:p>
@@ -2034,7 +2023,10 @@
         <w:ind w:left="227"/>
       </w:pPr>
       <w:r>
-        <w:t>Use at least TWO of today’s three patterns and underline every target structure you use.</w:t>
+        <w:rPr>
+          <w:b w:val="0"/>
+        </w:rPr>
+        <w:t>Then explain why the suggestion helps, give an example or some evidence, and round the paragraph off.</w:t>
       </w:r>
     </w:p>
     <w:p>
@@ -2043,123 +2035,305 @@
         <w:ind w:left="227"/>
       </w:pPr>
       <w:r>
-        <w:t>Follow the Lesson 2 chain: [Topic sentence] → [Explain] → [Example] → [Back to main idea].</w:t>
+        <w:rPr>
+          <w:b w:val="0"/>
+        </w:rPr>
+        <w:t>You do NOT need to use the Lesson 1 or Lesson 2 patterns in the explanation, the example or the round-off.</w:t>
       </w:r>
     </w:p>
     <w:p>
+      <w:pPr>
+        <w:spacing w:after="0"/>
+        <w:ind w:left="227"/>
+      </w:pPr>
+      <w:r>
+        <w:rPr>
+          <w:b w:val="0"/>
+        </w:rPr>
+        <w:t>Follow the chain: [Topic sentence] → [Explain] → [Example / evidence] → [Round off].</w:t>
+      </w:r>
+    </w:p>
+    <w:p>
+      <w:pPr>
+        <w:spacing w:after="0"/>
+      </w:pPr>
+      <w:r>
+        <w:rPr>
+          <w:b w:val="0"/>
+        </w:rPr>
+      </w:r>
+    </w:p>
+    <w:p>
+      <w:pPr>
+        <w:spacing w:before="160" w:after="80"/>
+      </w:pPr>
       <w:r>
         <w:rPr>
           <w:b/>
         </w:rPr>
-        <w:t>Write your paragraph below:</w:t>
+        <w:t>Write your three paragraphs below:</w:t>
       </w:r>
     </w:p>
     <w:p>
       <w:pPr>
-        <w:spacing w:after="200"/>
+        <w:spacing w:before="160" w:after="80"/>
       </w:pPr>
       <w:r>
         <w:rPr>
-          <w:rFonts w:ascii="Times New Roman" w:hAnsi="Times New Roman"/>
+          <w:b/>
+        </w:rPr>
+        <w:t>Paragraph 1:</w:t>
+      </w:r>
+    </w:p>
+    <w:p>
+      <w:pPr>
+        <w:spacing w:after="0"/>
+      </w:pPr>
+      <w:r>
+        <w:rPr>
+          <w:b w:val="0"/>
         </w:rPr>
         <w:t>________________________________________________________________________________</w:t>
       </w:r>
     </w:p>
     <w:p>
       <w:pPr>
-        <w:spacing w:after="200"/>
+        <w:spacing w:after="0"/>
       </w:pPr>
       <w:r>
         <w:rPr>
-          <w:rFonts w:ascii="Times New Roman" w:hAnsi="Times New Roman"/>
+          <w:b w:val="0"/>
         </w:rPr>
         <w:t>________________________________________________________________________________</w:t>
       </w:r>
     </w:p>
     <w:p>
       <w:pPr>
-        <w:spacing w:after="200"/>
+        <w:spacing w:after="0"/>
       </w:pPr>
       <w:r>
         <w:rPr>
-          <w:rFonts w:ascii="Times New Roman" w:hAnsi="Times New Roman"/>
+          <w:b w:val="0"/>
         </w:rPr>
         <w:t>________________________________________________________________________________</w:t>
       </w:r>
     </w:p>
     <w:p>
       <w:pPr>
-        <w:spacing w:after="200"/>
+        <w:spacing w:after="0"/>
       </w:pPr>
       <w:r>
         <w:rPr>
-          <w:rFonts w:ascii="Times New Roman" w:hAnsi="Times New Roman"/>
+          <w:b w:val="0"/>
         </w:rPr>
         <w:t>________________________________________________________________________________</w:t>
       </w:r>
     </w:p>
     <w:p>
       <w:pPr>
-        <w:spacing w:after="200"/>
+        <w:spacing w:after="0"/>
       </w:pPr>
       <w:r>
         <w:rPr>
-          <w:rFonts w:ascii="Times New Roman" w:hAnsi="Times New Roman"/>
+          <w:b w:val="0"/>
         </w:rPr>
         <w:t>________________________________________________________________________________</w:t>
       </w:r>
     </w:p>
     <w:p>
       <w:pPr>
-        <w:spacing w:after="200"/>
+        <w:spacing w:after="0"/>
       </w:pPr>
       <w:r>
         <w:rPr>
-          <w:rFonts w:ascii="Times New Roman" w:hAnsi="Times New Roman"/>
+          <w:b w:val="0"/>
         </w:rPr>
         <w:t>________________________________________________________________________________</w:t>
       </w:r>
     </w:p>
     <w:p>
       <w:pPr>
-        <w:spacing w:after="200"/>
+        <w:spacing w:after="0"/>
       </w:pPr>
       <w:r>
         <w:rPr>
-          <w:rFonts w:ascii="Times New Roman" w:hAnsi="Times New Roman"/>
+          <w:b w:val="0"/>
         </w:rPr>
         <w:t>________________________________________________________________________________</w:t>
       </w:r>
     </w:p>
     <w:p>
       <w:pPr>
-        <w:spacing w:after="200"/>
+        <w:spacing w:before="160" w:after="80"/>
       </w:pPr>
       <w:r>
         <w:rPr>
-          <w:rFonts w:ascii="Times New Roman" w:hAnsi="Times New Roman"/>
+          <w:b/>
+        </w:rPr>
+        <w:t>Paragraph 2:</w:t>
+      </w:r>
+    </w:p>
+    <w:p>
+      <w:pPr>
+        <w:spacing w:after="0"/>
+      </w:pPr>
+      <w:r>
+        <w:rPr>
+          <w:b w:val="0"/>
         </w:rPr>
         <w:t>________________________________________________________________________________</w:t>
       </w:r>
     </w:p>
     <w:p>
       <w:pPr>
-        <w:spacing w:after="200"/>
+        <w:spacing w:after="0"/>
       </w:pPr>
       <w:r>
         <w:rPr>
-          <w:rFonts w:ascii="Times New Roman" w:hAnsi="Times New Roman"/>
+          <w:b w:val="0"/>
         </w:rPr>
         <w:t>________________________________________________________________________________</w:t>
       </w:r>
     </w:p>
     <w:p>
       <w:pPr>
-        <w:spacing w:after="200"/>
+        <w:spacing w:after="0"/>
       </w:pPr>
       <w:r>
         <w:rPr>
-          <w:rFonts w:ascii="Times New Roman" w:hAnsi="Times New Roman"/>
+          <w:b w:val="0"/>
+        </w:rPr>
+        <w:t>________________________________________________________________________________</w:t>
+      </w:r>
+    </w:p>
+    <w:p>
+      <w:pPr>
+        <w:spacing w:after="0"/>
+      </w:pPr>
+      <w:r>
+        <w:rPr>
+          <w:b w:val="0"/>
+        </w:rPr>
+        <w:t>________________________________________________________________________________</w:t>
+      </w:r>
+    </w:p>
+    <w:p>
+      <w:pPr>
+        <w:spacing w:after="0"/>
+      </w:pPr>
+      <w:r>
+        <w:rPr>
+          <w:b w:val="0"/>
+        </w:rPr>
+        <w:t>________________________________________________________________________________</w:t>
+      </w:r>
+    </w:p>
+    <w:p>
+      <w:pPr>
+        <w:spacing w:after="0"/>
+      </w:pPr>
+      <w:r>
+        <w:rPr>
+          <w:b w:val="0"/>
+        </w:rPr>
+        <w:t>________________________________________________________________________________</w:t>
+      </w:r>
+    </w:p>
+    <w:p>
+      <w:pPr>
+        <w:spacing w:after="0"/>
+      </w:pPr>
+      <w:r>
+        <w:rPr>
+          <w:b w:val="0"/>
+        </w:rPr>
+        <w:t>________________________________________________________________________________</w:t>
+      </w:r>
+    </w:p>
+    <w:p>
+      <w:pPr>
+        <w:spacing w:before="160" w:after="80"/>
+      </w:pPr>
+      <w:r>
+        <w:rPr>
+          <w:b/>
+        </w:rPr>
+        <w:t>Paragraph 3:</w:t>
+      </w:r>
+    </w:p>
+    <w:p>
+      <w:pPr>
+        <w:spacing w:after="0"/>
+      </w:pPr>
+      <w:r>
+        <w:rPr>
+          <w:b w:val="0"/>
+        </w:rPr>
+        <w:t>________________________________________________________________________________</w:t>
+      </w:r>
+    </w:p>
+    <w:p>
+      <w:pPr>
+        <w:spacing w:after="0"/>
+      </w:pPr>
+      <w:r>
+        <w:rPr>
+          <w:b w:val="0"/>
+        </w:rPr>
+        <w:t>________________________________________________________________________________</w:t>
+      </w:r>
+    </w:p>
+    <w:p>
+      <w:pPr>
+        <w:spacing w:after="0"/>
+      </w:pPr>
+      <w:r>
+        <w:rPr>
+          <w:b w:val="0"/>
+        </w:rPr>
+        <w:t>________________________________________________________________________________</w:t>
+      </w:r>
+    </w:p>
+    <w:p>
+      <w:pPr>
+        <w:spacing w:after="0"/>
+      </w:pPr>
+      <w:r>
+        <w:rPr>
+          <w:b w:val="0"/>
+        </w:rPr>
+        <w:t>________________________________________________________________________________</w:t>
+      </w:r>
+    </w:p>
+    <w:p>
+      <w:pPr>
+        <w:spacing w:after="0"/>
+      </w:pPr>
+      <w:r>
+        <w:rPr>
+          <w:b w:val="0"/>
+        </w:rPr>
+        <w:t>________________________________________________________________________________</w:t>
+      </w:r>
+    </w:p>
+    <w:p>
+      <w:pPr>
+        <w:spacing w:after="0"/>
+      </w:pPr>
+      <w:r>
+        <w:rPr>
+          <w:b w:val="0"/>
+        </w:rPr>
+        <w:t>________________________________________________________________________________</w:t>
+      </w:r>
+    </w:p>
+    <w:p>
+      <w:pPr>
+        <w:spacing w:after="0"/>
+      </w:pPr>
+      <w:r>
+        <w:rPr>
+          <w:b w:val="0"/>
         </w:rPr>
         <w:t>________________________________________________________________________________</w:t>
       </w:r>

</xml_diff>

<commit_message>
Rev 6: Pattern 1 now 'There is an urgent need for [doer] to [base verb phrase]' so it can open a paragraph
</commit_message>
<xml_diff>
--- a/6B Grammar Lesson 3 - Discussing Solutions (Students).docx
+++ b/6B Grammar Lesson 3 - Discussing Solutions (Students).docx
@@ -797,16 +797,7 @@
               <w:t xml:space="preserve">Target Formula: </w:t>
             </w:r>
             <w:r>
-              <w:t>It is high time that [doer] [</w:t>
-            </w:r>
-            <w:r>
-              <w:rPr>
-                <w:highlight w:val="yellow"/>
-              </w:rPr>
-              <w:t>PAST-TENSE</w:t>
-            </w:r>
-            <w:r>
-              <w:t xml:space="preserve"> verb phrase].</w:t>
+              <w:t>There is an urgent need for [doer] to [base verb phrase].</w:t>
             </w:r>
           </w:p>
         </w:tc>
@@ -876,7 +867,7 @@
               <w:rPr>
                 <w:b/>
               </w:rPr>
-              <w:t>It is high time that</w:t>
+              <w:t>There is an urgent need for</w:t>
             </w:r>
             <w:r>
               <w:t xml:space="preserve"> the government </w:t>
@@ -885,7 +876,7 @@
               <w:rPr>
                 <w:b/>
               </w:rPr>
-              <w:t>invested</w:t>
+              <w:t>to invest</w:t>
             </w:r>
             <w:r>
               <w:t xml:space="preserve"> in free, accessible sports facilities in every district.</w:t>

</xml_diff>

<commit_message>
Rev 7: five-part layout (B vocabulary / C sentences / D sets / E writing), Part E one-suggestion task with three model paragraphs
</commit_message>
<xml_diff>
--- a/6B Grammar Lesson 3 - Discussing Solutions (Students).docx
+++ b/6B Grammar Lesson 3 - Discussing Solutions (Students).docx
@@ -664,48 +664,61 @@
     </w:p>
     <w:p>
       <w:pPr>
-        <w:rPr>
-          <w:b/>
-        </w:rPr>
-      </w:pPr>
-      <w:r>
-        <w:rPr>
-          <w:b/>
-        </w:rPr>
-        <w:br w:type="page"/>
-      </w:r>
-    </w:p>
-    <w:p>
-      <w:pPr>
         <w:spacing w:before="160" w:after="120"/>
       </w:pPr>
       <w:r>
         <w:rPr>
           <w:b/>
         </w:rPr>
-        <w:lastRenderedPageBreak/>
-        <w:t>PART B: UPGRADING SENTENCES — MAKING SUGGESTIONS</w:t>
+        <w:t>PART B: UPGRADING VOCABULARY</w:t>
       </w:r>
     </w:p>
     <w:p>
+      <w:pPr>
+        <w:spacing w:after="0"/>
+        <w:ind w:left="227"/>
+      </w:pPr>
       <w:r>
+        <w:rPr>
+          <w:b w:val="0"/>
+        </w:rPr>
         <w:t xml:space="preserve">In the paragraph that suggests solutions, most students write </w:t>
       </w:r>
       <w:r>
         <w:rPr>
           <w:b/>
-          <w:bCs/>
         </w:rPr>
-        <w:t>“Schools can …”, “The government can …” and “Parents can …”</w:t>
+        <w:t>“Schools can …”</w:t>
       </w:r>
       <w:r>
-        <w:t>. These sentences are correct, but they are plain</w:t>
+        <w:rPr>
+          <w:b w:val="0"/>
+        </w:rPr>
+        <w:t xml:space="preserve">, </w:t>
       </w:r>
       <w:r>
-        <w:t xml:space="preserve">. </w:t>
+        <w:rPr>
+          <w:b/>
+        </w:rPr>
+        <w:t>“The government can …”</w:t>
       </w:r>
       <w:r>
-        <w:t xml:space="preserve">Part B gives you THREE patterns that upgrade exactly these sentences. </w:t>
+        <w:rPr>
+          <w:b w:val="0"/>
+        </w:rPr>
+        <w:t xml:space="preserve"> and </w:t>
+      </w:r>
+      <w:r>
+        <w:rPr>
+          <w:b/>
+        </w:rPr>
+        <w:t>“Parents can …”</w:t>
+      </w:r>
+      <w:r>
+        <w:rPr>
+          <w:b w:val="0"/>
+        </w:rPr>
+        <w:t>. These sentences are correct, but they are plain. This part upgrades the WORDS you use, and Part C shows you the three sentence patterns that upgrade the sentences themselves.</w:t>
       </w:r>
     </w:p>
     <w:p>
@@ -765,6 +778,255 @@
       <w:pPr>
         <w:spacing w:after="0"/>
       </w:pPr>
+    </w:p>
+    <w:p>
+      <w:pPr>
+        <w:spacing w:before="160" w:after="120"/>
+      </w:pPr>
+      <w:r>
+        <w:rPr>
+          <w:b/>
+        </w:rPr>
+        <w:t>LEVEL 3 → LEVEL 5 VOCABULARY (physical fitness and awareness)</w:t>
+      </w:r>
+    </w:p>
+    <w:tbl>
+      <w:tblPr>
+        <w:tblStyle w:val="TableGrid"/>
+        <w:tblW w:w="0" w:type="auto"/>
+        <w:tblLayout w:type="fixed"/>
+        <w:tblLook w:val="04A0" w:firstRow="1" w:lastRow="0" w:firstColumn="1" w:lastColumn="0" w:noHBand="0" w:noVBand="1"/>
+      </w:tblPr>
+      <w:tblGrid>
+        <w:gridCol w:w="454"/>
+        <w:gridCol w:w="3402"/>
+        <w:gridCol w:w="5783"/>
+      </w:tblGrid>
+      <w:tr>
+        <w:tc>
+          <w:tcPr>
+            <w:tcW w:w="454" w:type="dxa"/>
+            <w:shd w:val="clear" w:color="auto" w:fill="D9D9D9"/>
+          </w:tcPr>
+          <w:p>
+            <w:r>
+              <w:rPr>
+                <w:b/>
+              </w:rPr>
+              <w:t>#</w:t>
+            </w:r>
+          </w:p>
+        </w:tc>
+        <w:tc>
+          <w:tcPr>
+            <w:tcW w:w="3402" w:type="dxa"/>
+            <w:shd w:val="clear" w:color="auto" w:fill="D9D9D9"/>
+          </w:tcPr>
+          <w:p>
+            <w:r>
+              <w:rPr>
+                <w:b/>
+              </w:rPr>
+              <w:t>Level 3 (what students write)</w:t>
+            </w:r>
+          </w:p>
+        </w:tc>
+        <w:tc>
+          <w:tcPr>
+            <w:tcW w:w="5783" w:type="dxa"/>
+            <w:shd w:val="clear" w:color="auto" w:fill="D9D9D9"/>
+          </w:tcPr>
+          <w:p>
+            <w:r>
+              <w:rPr>
+                <w:b/>
+              </w:rPr>
+              <w:t>Your Level 5 upgrade (upgrade the Level 3 phrase)</w:t>
+            </w:r>
+          </w:p>
+        </w:tc>
+      </w:tr>
+      <w:tr>
+        <w:tc>
+          <w:tcPr>
+            <w:tcW w:w="454" w:type="dxa"/>
+          </w:tcPr>
+          <w:p>
+            <w:r>
+              <w:rPr>
+                <w:b/>
+              </w:rPr>
+              <w:t>1</w:t>
+            </w:r>
+          </w:p>
+        </w:tc>
+        <w:tc>
+          <w:tcPr>
+            <w:tcW w:w="3402" w:type="dxa"/>
+          </w:tcPr>
+          <w:p>
+            <w:r>
+              <w:t>make people healthier</w:t>
+            </w:r>
+          </w:p>
+        </w:tc>
+        <w:tc>
+          <w:tcPr>
+            <w:tcW w:w="5783" w:type="dxa"/>
+          </w:tcPr>
+          <w:p/>
+          <w:p/>
+        </w:tc>
+      </w:tr>
+      <w:tr>
+        <w:tc>
+          <w:tcPr>
+            <w:tcW w:w="454" w:type="dxa"/>
+          </w:tcPr>
+          <w:p>
+            <w:r>
+              <w:rPr>
+                <w:b/>
+              </w:rPr>
+              <w:t>2</w:t>
+            </w:r>
+          </w:p>
+        </w:tc>
+        <w:tc>
+          <w:tcPr>
+            <w:tcW w:w="3402" w:type="dxa"/>
+          </w:tcPr>
+          <w:p>
+            <w:r>
+              <w:t>tell people about the importance of exercise</w:t>
+            </w:r>
+          </w:p>
+        </w:tc>
+        <w:tc>
+          <w:tcPr>
+            <w:tcW w:w="5783" w:type="dxa"/>
+          </w:tcPr>
+          <w:p/>
+          <w:p/>
+        </w:tc>
+      </w:tr>
+      <w:tr>
+        <w:tc>
+          <w:tcPr>
+            <w:tcW w:w="454" w:type="dxa"/>
+          </w:tcPr>
+          <w:p>
+            <w:r>
+              <w:rPr>
+                <w:b/>
+              </w:rPr>
+              <w:t>3</w:t>
+            </w:r>
+          </w:p>
+        </w:tc>
+        <w:tc>
+          <w:tcPr>
+            <w:tcW w:w="3402" w:type="dxa"/>
+          </w:tcPr>
+          <w:p>
+            <w:r>
+              <w:t>do exercise</w:t>
+            </w:r>
+          </w:p>
+        </w:tc>
+        <w:tc>
+          <w:tcPr>
+            <w:tcW w:w="5783" w:type="dxa"/>
+          </w:tcPr>
+          <w:p/>
+          <w:p/>
+        </w:tc>
+      </w:tr>
+      <w:tr>
+        <w:tc>
+          <w:tcPr>
+            <w:tcW w:w="454" w:type="dxa"/>
+          </w:tcPr>
+          <w:p>
+            <w:r>
+              <w:rPr>
+                <w:b/>
+              </w:rPr>
+              <w:t>4</w:t>
+            </w:r>
+          </w:p>
+        </w:tc>
+        <w:tc>
+          <w:tcPr>
+            <w:tcW w:w="3402" w:type="dxa"/>
+          </w:tcPr>
+          <w:p>
+            <w:r>
+              <w:t>build more sports places</w:t>
+            </w:r>
+          </w:p>
+        </w:tc>
+        <w:tc>
+          <w:tcPr>
+            <w:tcW w:w="5783" w:type="dxa"/>
+          </w:tcPr>
+          <w:p/>
+          <w:p/>
+        </w:tc>
+      </w:tr>
+      <w:tr>
+        <w:tc>
+          <w:tcPr>
+            <w:tcW w:w="454" w:type="dxa"/>
+          </w:tcPr>
+          <w:p>
+            <w:r>
+              <w:rPr>
+                <w:b/>
+              </w:rPr>
+              <w:t>5</w:t>
+            </w:r>
+          </w:p>
+        </w:tc>
+        <w:tc>
+          <w:tcPr>
+            <w:tcW w:w="3402" w:type="dxa"/>
+          </w:tcPr>
+          <w:p>
+            <w:r>
+              <w:t>stop people from being lazy</w:t>
+            </w:r>
+          </w:p>
+        </w:tc>
+        <w:tc>
+          <w:tcPr>
+            <w:tcW w:w="5783" w:type="dxa"/>
+          </w:tcPr>
+          <w:p/>
+          <w:p/>
+        </w:tc>
+      </w:tr>
+    </w:tbl>
+    <w:p>
+      <w:pPr>
+        <w:spacing w:after="0"/>
+      </w:pPr>
+      <w:r>
+        <w:rPr>
+          <w:b w:val="0"/>
+        </w:rPr>
+      </w:r>
+    </w:p>
+    <w:p>
+      <w:pPr>
+        <w:spacing w:before="160" w:after="120"/>
+      </w:pPr>
+      <w:r>
+        <w:rPr>
+          <w:b/>
+        </w:rPr>
+        <w:t>PART C: UPGRADING SENTENCE</w:t>
+      </w:r>
     </w:p>
     <w:tbl>
       <w:tblPr>
@@ -885,11 +1147,6 @@
         </w:tc>
       </w:tr>
     </w:tbl>
-    <w:p>
-      <w:pPr>
-        <w:spacing w:after="0"/>
-      </w:pPr>
-    </w:p>
     <w:tbl>
       <w:tblPr>
         <w:tblStyle w:val="TableGrid"/>
@@ -927,11 +1184,6 @@
         </w:tc>
       </w:tr>
     </w:tbl>
-    <w:p>
-      <w:pPr>
-        <w:spacing w:after="0"/>
-      </w:pPr>
-    </w:p>
     <w:tbl>
       <w:tblPr>
         <w:tblStyle w:val="TableGrid"/>
@@ -1009,11 +1261,6 @@
         </w:tc>
       </w:tr>
     </w:tbl>
-    <w:p>
-      <w:pPr>
-        <w:spacing w:after="0"/>
-      </w:pPr>
-    </w:p>
     <w:tbl>
       <w:tblPr>
         <w:tblStyle w:val="TableGrid"/>
@@ -1051,11 +1298,6 @@
         </w:tc>
       </w:tr>
     </w:tbl>
-    <w:p>
-      <w:pPr>
-        <w:spacing w:after="0"/>
-      </w:pPr>
-    </w:p>
     <w:tbl>
       <w:tblPr>
         <w:tblStyle w:val="TableGrid"/>
@@ -1126,326 +1368,18 @@
     </w:tbl>
     <w:p>
       <w:pPr>
-        <w:spacing w:after="0"/>
-      </w:pPr>
-    </w:p>
-    <w:p>
-      <w:pPr>
         <w:spacing w:before="160" w:after="120"/>
       </w:pPr>
       <w:r>
         <w:rPr>
           <w:b/>
         </w:rPr>
-        <w:t>LEVEL 3 → LEVEL 5 VOCABULARY (physical fitness and awareness)</w:t>
-      </w:r>
-    </w:p>
-    <w:tbl>
-      <w:tblPr>
-        <w:tblStyle w:val="TableGrid"/>
-        <w:tblW w:w="0" w:type="auto"/>
-        <w:tblLayout w:type="fixed"/>
-        <w:tblLook w:val="04A0" w:firstRow="1" w:lastRow="0" w:firstColumn="1" w:lastColumn="0" w:noHBand="0" w:noVBand="1"/>
-      </w:tblPr>
-      <w:tblGrid>
-        <w:gridCol w:w="454"/>
-        <w:gridCol w:w="3402"/>
-        <w:gridCol w:w="5783"/>
-      </w:tblGrid>
-      <w:tr>
-        <w:tc>
-          <w:tcPr>
-            <w:tcW w:w="454" w:type="dxa"/>
-            <w:shd w:val="clear" w:color="auto" w:fill="D9D9D9"/>
-          </w:tcPr>
-          <w:p>
-            <w:r>
-              <w:rPr>
-                <w:b/>
-              </w:rPr>
-              <w:t>#</w:t>
-            </w:r>
-          </w:p>
-        </w:tc>
-        <w:tc>
-          <w:tcPr>
-            <w:tcW w:w="3402" w:type="dxa"/>
-            <w:shd w:val="clear" w:color="auto" w:fill="D9D9D9"/>
-          </w:tcPr>
-          <w:p>
-            <w:r>
-              <w:rPr>
-                <w:b/>
-              </w:rPr>
-              <w:t>Level 3 (what students write)</w:t>
-            </w:r>
-          </w:p>
-        </w:tc>
-        <w:tc>
-          <w:tcPr>
-            <w:tcW w:w="5783" w:type="dxa"/>
-            <w:shd w:val="clear" w:color="auto" w:fill="D9D9D9"/>
-          </w:tcPr>
-          <w:p>
-            <w:r>
-              <w:rPr>
-                <w:b/>
-              </w:rPr>
-              <w:t>Level 5 upgrade (key words in bold)</w:t>
-            </w:r>
-          </w:p>
-        </w:tc>
-      </w:tr>
-      <w:tr>
-        <w:tc>
-          <w:tcPr>
-            <w:tcW w:w="454" w:type="dxa"/>
-          </w:tcPr>
-          <w:p>
-            <w:r>
-              <w:rPr>
-                <w:b/>
-              </w:rPr>
-              <w:t>1</w:t>
-            </w:r>
-          </w:p>
-        </w:tc>
-        <w:tc>
-          <w:tcPr>
-            <w:tcW w:w="3402" w:type="dxa"/>
-          </w:tcPr>
-          <w:p>
-            <w:r>
-              <w:t>make people healthier</w:t>
-            </w:r>
-          </w:p>
-        </w:tc>
-        <w:tc>
-          <w:tcPr>
-            <w:tcW w:w="5783" w:type="dxa"/>
-          </w:tcPr>
-          <w:p>
-            <w:r>
-              <w:rPr>
-                <w:b/>
-              </w:rPr>
-              <w:t>enhance citizens’ physical well-being</w:t>
-            </w:r>
-          </w:p>
-          <w:p>
-            <w:r>
-              <w:rPr>
-                <w:i/>
-              </w:rPr>
-              <w:t>e.g. Regular exercise enhances citizens’ physical well-being.</w:t>
-            </w:r>
-          </w:p>
-        </w:tc>
-      </w:tr>
-      <w:tr>
-        <w:tc>
-          <w:tcPr>
-            <w:tcW w:w="454" w:type="dxa"/>
-          </w:tcPr>
-          <w:p>
-            <w:r>
-              <w:rPr>
-                <w:b/>
-              </w:rPr>
-              <w:t>2</w:t>
-            </w:r>
-          </w:p>
-        </w:tc>
-        <w:tc>
-          <w:tcPr>
-            <w:tcW w:w="3402" w:type="dxa"/>
-          </w:tcPr>
-          <w:p>
-            <w:r>
-              <w:t>tell people about the importance of exercise</w:t>
-            </w:r>
-          </w:p>
-        </w:tc>
-        <w:tc>
-          <w:tcPr>
-            <w:tcW w:w="5783" w:type="dxa"/>
-          </w:tcPr>
-          <w:p>
-            <w:r>
-              <w:rPr>
-                <w:b/>
-              </w:rPr>
-              <w:t>raise public awareness of the importance of regular exercise</w:t>
-            </w:r>
-          </w:p>
-          <w:p>
-            <w:r>
-              <w:rPr>
-                <w:i/>
-              </w:rPr>
-              <w:t>e.g. A city-wide campaign would raise public awareness of the importance of regular exercise.</w:t>
-            </w:r>
-          </w:p>
-        </w:tc>
-      </w:tr>
-      <w:tr>
-        <w:tc>
-          <w:tcPr>
-            <w:tcW w:w="454" w:type="dxa"/>
-          </w:tcPr>
-          <w:p>
-            <w:r>
-              <w:rPr>
-                <w:b/>
-              </w:rPr>
-              <w:t>3</w:t>
-            </w:r>
-          </w:p>
-        </w:tc>
-        <w:tc>
-          <w:tcPr>
-            <w:tcW w:w="3402" w:type="dxa"/>
-          </w:tcPr>
-          <w:p>
-            <w:r>
-              <w:t>do exercise</w:t>
-            </w:r>
-          </w:p>
-        </w:tc>
-        <w:tc>
-          <w:tcPr>
-            <w:tcW w:w="5783" w:type="dxa"/>
-          </w:tcPr>
-          <w:p>
-            <w:r>
-              <w:rPr>
-                <w:b/>
-              </w:rPr>
-              <w:t>take regular exercise / adopt an active lifestyle</w:t>
-            </w:r>
-          </w:p>
-          <w:p>
-            <w:r>
-              <w:rPr>
-                <w:i/>
-              </w:rPr>
-              <w:t>e.g. Citizens who take regular exercise are far less likely to fall ill.</w:t>
-            </w:r>
-          </w:p>
-        </w:tc>
-      </w:tr>
-      <w:tr>
-        <w:tc>
-          <w:tcPr>
-            <w:tcW w:w="454" w:type="dxa"/>
-          </w:tcPr>
-          <w:p>
-            <w:r>
-              <w:rPr>
-                <w:b/>
-              </w:rPr>
-              <w:t>4</w:t>
-            </w:r>
-          </w:p>
-        </w:tc>
-        <w:tc>
-          <w:tcPr>
-            <w:tcW w:w="3402" w:type="dxa"/>
-          </w:tcPr>
-          <w:p>
-            <w:r>
-              <w:t>build more sports places</w:t>
-            </w:r>
-          </w:p>
-        </w:tc>
-        <w:tc>
-          <w:tcPr>
-            <w:tcW w:w="5783" w:type="dxa"/>
-          </w:tcPr>
-          <w:p>
-            <w:r>
-              <w:rPr>
-                <w:b/>
-              </w:rPr>
-              <w:t>provide accessible sports facilities</w:t>
-            </w:r>
-          </w:p>
-          <w:p>
-            <w:r>
-              <w:rPr>
-                <w:i/>
-              </w:rPr>
-              <w:t>e.g. Accessible sports facilities encourage even the busiest workers to exercise.</w:t>
-            </w:r>
-          </w:p>
-        </w:tc>
-      </w:tr>
-      <w:tr>
-        <w:tc>
-          <w:tcPr>
-            <w:tcW w:w="454" w:type="dxa"/>
-          </w:tcPr>
-          <w:p>
-            <w:r>
-              <w:rPr>
-                <w:b/>
-              </w:rPr>
-              <w:t>5</w:t>
-            </w:r>
-          </w:p>
-        </w:tc>
-        <w:tc>
-          <w:tcPr>
-            <w:tcW w:w="3402" w:type="dxa"/>
-          </w:tcPr>
-          <w:p>
-            <w:r>
-              <w:t>stop people from being lazy</w:t>
-            </w:r>
-          </w:p>
-        </w:tc>
-        <w:tc>
-          <w:tcPr>
-            <w:tcW w:w="5783" w:type="dxa"/>
-          </w:tcPr>
-          <w:p>
-            <w:r>
-              <w:rPr>
-                <w:b/>
-              </w:rPr>
-              <w:t>combat sedentary lifestyles</w:t>
-            </w:r>
-          </w:p>
-          <w:p>
-            <w:r>
-              <w:rPr>
-                <w:i/>
-              </w:rPr>
-              <w:t>e.g. A morning workout scheme can combat sedentary lifestyles among office workers.</w:t>
-            </w:r>
-          </w:p>
-        </w:tc>
-      </w:tr>
-    </w:tbl>
-    <w:p>
-      <w:pPr>
-        <w:spacing w:after="0"/>
-      </w:pPr>
-    </w:p>
-    <w:p>
-      <w:pPr>
-        <w:spacing w:before="160" w:after="120"/>
-      </w:pPr>
-      <w:r>
-        <w:rPr>
-          <w:b/>
-        </w:rPr>
-        <w:t>PART C: PRACTICE SETS (6 SETS)</w:t>
+        <w:t>PART D: PRACTICE SETS</w:t>
       </w:r>
     </w:p>
     <w:p>
       <w:r>
-        <w:t>Upgrade each simple sentence with the pattern shown, and keep the pattern to ONE clause, as taught in Part B. The topics are different from the fitness topic in Part B. Sets 4–6 are more challenging: you must join the TWO simple sentences into ONE upgraded sentence.</w:t>
+        <w:t>Upgrade each simple sentence with the pattern shown, and keep the pattern to ONE clause, as taught in Part C. The topics are different from the fitness topic in Part C. Sets 4–6 are more challenging: you must join the TWO simple sentences into ONE upgraded sentence.</w:t>
       </w:r>
     </w:p>
     <w:p>
@@ -1937,8 +1871,7 @@
         <w:rPr>
           <w:b/>
         </w:rPr>
-        <w:lastRenderedPageBreak/>
-        <w:t>PART D: WRITING PRACTICE</w:t>
+        <w:t>PART E: WRITING PRACTICE</w:t>
       </w:r>
     </w:p>
     <w:tbl>
@@ -1967,7 +1900,7 @@
               <w:rPr>
                 <w:b w:val="0"/>
               </w:rPr>
-              <w:t>You are a Form 6 student. Hong Kong’s population is ageing rapidly, and the needs of elderly citizens have become a pressing social issue. Write a letter to the editor of the Hong Kong Young Post, suggesting THREE ways in which our city can care for its growing number of elderly citizens.</w:t>
+              <w:t>You are a Form 6 student. A recent survey has found that young people in Hong Kong take far less exercise than they should, and the government is now inviting ideas on how to improve their physical well-being. Write a letter to the editor of the Hong Kong Young Post, suggesting ONE way in which our city can improve the physical well-being of its young people.</w:t>
             </w:r>
           </w:p>
         </w:tc>
@@ -1993,7 +1926,7 @@
         <w:rPr>
           <w:b w:val="0"/>
         </w:rPr>
-        <w:t>Write THREE body paragraphs (about 100 words each) for this letter.</w:t>
+        <w:t>Write ONE body paragraph (about 100 words) for this letter — not the whole letter.</w:t>
       </w:r>
     </w:p>
     <w:p>
@@ -2005,7 +1938,7 @@
         <w:rPr>
           <w:b w:val="0"/>
         </w:rPr>
-        <w:t>Begin each paragraph with a topic sentence that makes ONE suggestion, using a different pattern from today’s lesson in each paragraph.</w:t>
+        <w:t>Make ONE suggestion about improving physical well-being, and open your paragraph with ONE of today’s three patterns as the topic sentence.</w:t>
       </w:r>
     </w:p>
     <w:p>
@@ -2062,18 +1995,7 @@
         <w:rPr>
           <w:b/>
         </w:rPr>
-        <w:t>Write your three paragraphs below:</w:t>
-      </w:r>
-    </w:p>
-    <w:p>
-      <w:pPr>
-        <w:spacing w:before="160" w:after="80"/>
-      </w:pPr>
-      <w:r>
-        <w:rPr>
-          <w:b/>
-        </w:rPr>
-        <w:t>Paragraph 1:</w:t>
+        <w:t>Write your paragraph below:</w:t>
       </w:r>
     </w:p>
     <w:p>
@@ -2107,149 +2029,6 @@
           <w:b w:val="0"/>
         </w:rPr>
         <w:t>________________________________________________________________________________</w:t>
-      </w:r>
-    </w:p>
-    <w:p>
-      <w:pPr>
-        <w:spacing w:after="0"/>
-      </w:pPr>
-      <w:r>
-        <w:rPr>
-          <w:b w:val="0"/>
-        </w:rPr>
-        <w:t>________________________________________________________________________________</w:t>
-      </w:r>
-    </w:p>
-    <w:p>
-      <w:pPr>
-        <w:spacing w:after="0"/>
-      </w:pPr>
-      <w:r>
-        <w:rPr>
-          <w:b w:val="0"/>
-        </w:rPr>
-        <w:t>________________________________________________________________________________</w:t>
-      </w:r>
-    </w:p>
-    <w:p>
-      <w:pPr>
-        <w:spacing w:after="0"/>
-      </w:pPr>
-      <w:r>
-        <w:rPr>
-          <w:b w:val="0"/>
-        </w:rPr>
-        <w:t>________________________________________________________________________________</w:t>
-      </w:r>
-    </w:p>
-    <w:p>
-      <w:pPr>
-        <w:spacing w:after="0"/>
-      </w:pPr>
-      <w:r>
-        <w:rPr>
-          <w:b w:val="0"/>
-        </w:rPr>
-        <w:t>________________________________________________________________________________</w:t>
-      </w:r>
-    </w:p>
-    <w:p>
-      <w:pPr>
-        <w:spacing w:before="160" w:after="80"/>
-      </w:pPr>
-      <w:r>
-        <w:rPr>
-          <w:b/>
-        </w:rPr>
-        <w:t>Paragraph 2:</w:t>
-      </w:r>
-    </w:p>
-    <w:p>
-      <w:pPr>
-        <w:spacing w:after="0"/>
-      </w:pPr>
-      <w:r>
-        <w:rPr>
-          <w:b w:val="0"/>
-        </w:rPr>
-        <w:t>________________________________________________________________________________</w:t>
-      </w:r>
-    </w:p>
-    <w:p>
-      <w:pPr>
-        <w:spacing w:after="0"/>
-      </w:pPr>
-      <w:r>
-        <w:rPr>
-          <w:b w:val="0"/>
-        </w:rPr>
-        <w:t>________________________________________________________________________________</w:t>
-      </w:r>
-    </w:p>
-    <w:p>
-      <w:pPr>
-        <w:spacing w:after="0"/>
-      </w:pPr>
-      <w:r>
-        <w:rPr>
-          <w:b w:val="0"/>
-        </w:rPr>
-        <w:t>________________________________________________________________________________</w:t>
-      </w:r>
-    </w:p>
-    <w:p>
-      <w:pPr>
-        <w:spacing w:after="0"/>
-      </w:pPr>
-      <w:r>
-        <w:rPr>
-          <w:b w:val="0"/>
-        </w:rPr>
-        <w:t>________________________________________________________________________________</w:t>
-      </w:r>
-    </w:p>
-    <w:p>
-      <w:pPr>
-        <w:spacing w:after="0"/>
-      </w:pPr>
-      <w:r>
-        <w:rPr>
-          <w:b w:val="0"/>
-        </w:rPr>
-        <w:t>________________________________________________________________________________</w:t>
-      </w:r>
-    </w:p>
-    <w:p>
-      <w:pPr>
-        <w:spacing w:after="0"/>
-      </w:pPr>
-      <w:r>
-        <w:rPr>
-          <w:b w:val="0"/>
-        </w:rPr>
-        <w:t>________________________________________________________________________________</w:t>
-      </w:r>
-    </w:p>
-    <w:p>
-      <w:pPr>
-        <w:spacing w:after="0"/>
-      </w:pPr>
-      <w:r>
-        <w:rPr>
-          <w:b w:val="0"/>
-        </w:rPr>
-        <w:t>________________________________________________________________________________</w:t>
-      </w:r>
-    </w:p>
-    <w:p>
-      <w:pPr>
-        <w:spacing w:before="160" w:after="80"/>
-      </w:pPr>
-      <w:r>
-        <w:rPr>
-          <w:b/>
-        </w:rPr>
-        <w:t>Paragraph 3:</w:t>
       </w:r>
     </w:p>
     <w:p>

</xml_diff>

<commit_message>
Rev 8: Part A cut to her 6 items; Part B = vocabulary upgrade practice (no instructions); Part C = the three patterns
</commit_message>
<xml_diff>
--- a/6B Grammar Lesson 3 - Discussing Solutions (Students).docx
+++ b/6B Grammar Lesson 3 - Discussing Solutions (Students).docx
@@ -126,7 +126,7 @@
         <w:rPr>
           <w:b/>
         </w:rPr>
-        <w:t>PART A: PROOFREADING (10 SENTENCES)</w:t>
+        <w:t>PART A: PROOFREADING (6 SENTENCES)</w:t>
       </w:r>
     </w:p>
     <w:p>
@@ -156,6 +156,12 @@
             <w:pPr>
               <w:spacing w:before="240"/>
             </w:pPr>
+            <w:proofErr w:type="gramStart"/>
+            <w:proofErr w:type="gramEnd"/>
+            <w:proofErr w:type="spellStart"/>
+            <w:proofErr w:type="gramStart"/>
+            <w:proofErr w:type="spellEnd"/>
+            <w:proofErr w:type="gramEnd"/>
             <w:r>
               <w:rPr>
                 <w:b/>
@@ -163,37 +169,19 @@
               <w:t xml:space="preserve">1. </w:t>
             </w:r>
             <w:r>
-              <w:t xml:space="preserve">In recent years, food delivery apps </w:t>
-            </w:r>
-            <w:proofErr w:type="gramStart"/>
-            <w:r>
-              <w:t>ha</w:t>
-            </w:r>
-            <w:r>
-              <w:t>s</w:t>
-            </w:r>
-            <w:proofErr w:type="gramEnd"/>
-            <w:r>
-              <w:t xml:space="preserve"> </w:t>
-            </w:r>
-            <w:proofErr w:type="spellStart"/>
-            <w:proofErr w:type="gramStart"/>
-            <w:r>
-              <w:t>became</w:t>
-            </w:r>
-            <w:proofErr w:type="spellEnd"/>
-            <w:proofErr w:type="gramEnd"/>
-            <w:r>
-              <w:t xml:space="preserve"> an indispensabl</w:t>
-            </w:r>
-            <w:r>
-              <w:t>e</w:t>
-            </w:r>
-            <w:r>
-              <w:t xml:space="preserve"> part of daily life for busy office workers.</w:t>
+              <w:t>In recent years, food delivery apps has became an indispensable part of daily life for busy office workers.</w:t>
             </w:r>
           </w:p>
           <w:p>
+            <w:pPr>
+              <w:spacing w:before="240"/>
+            </w:pPr>
+            <w:proofErr w:type="gramStart"/>
+            <w:proofErr w:type="gramEnd"/>
+            <w:proofErr w:type="spellStart"/>
+            <w:proofErr w:type="gramStart"/>
+            <w:proofErr w:type="spellEnd"/>
+            <w:proofErr w:type="gramEnd"/>
             <w:r>
               <w:rPr>
                 <w:b/>
@@ -201,26 +189,19 @@
               <w:t xml:space="preserve">2. </w:t>
             </w:r>
             <w:r>
-              <w:t xml:space="preserve">Living in a </w:t>
-            </w:r>
-            <w:proofErr w:type="gramStart"/>
-            <w:r>
-              <w:t>fast-pace</w:t>
-            </w:r>
-            <w:proofErr w:type="gramEnd"/>
-            <w:r>
-              <w:t xml:space="preserve"> society, commuters </w:t>
-            </w:r>
-            <w:proofErr w:type="gramStart"/>
-            <w:r>
-              <w:t>is</w:t>
-            </w:r>
-            <w:proofErr w:type="gramEnd"/>
-            <w:r>
-              <w:t xml:space="preserve"> constantly exposed to noise pollution.</w:t>
+              <w:t>It is undeniable that early childhood education play a pivotal role in shape children’s characters.</w:t>
             </w:r>
           </w:p>
           <w:p>
+            <w:pPr>
+              <w:spacing w:before="240"/>
+            </w:pPr>
+            <w:proofErr w:type="gramStart"/>
+            <w:proofErr w:type="gramEnd"/>
+            <w:proofErr w:type="spellStart"/>
+            <w:proofErr w:type="gramStart"/>
+            <w:proofErr w:type="spellEnd"/>
+            <w:proofErr w:type="gramEnd"/>
             <w:r>
               <w:rPr>
                 <w:b/>
@@ -228,10 +209,19 @@
               <w:t xml:space="preserve">3. </w:t>
             </w:r>
             <w:r>
-              <w:t>In recent time, the issue of ageing population has spark widespread concern across society.</w:t>
+              <w:t>To begin with, cultural exchange programme offer students golden opportunity to broaden their horizon.</w:t>
             </w:r>
           </w:p>
           <w:p>
+            <w:pPr>
+              <w:spacing w:before="240"/>
+            </w:pPr>
+            <w:proofErr w:type="gramStart"/>
+            <w:proofErr w:type="gramEnd"/>
+            <w:proofErr w:type="spellStart"/>
+            <w:proofErr w:type="gramStart"/>
+            <w:proofErr w:type="spellEnd"/>
+            <w:proofErr w:type="gramEnd"/>
             <w:r>
               <w:rPr>
                 <w:b/>
@@ -239,10 +229,19 @@
               <w:t xml:space="preserve">4. </w:t>
             </w:r>
             <w:r>
-              <w:t>It is undeniable that early childhood education play a pivotal role in shape children’s characters.</w:t>
+              <w:t>From the perspective of parents, school counselling services allow it to understand their children better, which in turn strengthen family relationships.</w:t>
             </w:r>
           </w:p>
           <w:p>
+            <w:pPr>
+              <w:spacing w:before="240"/>
+            </w:pPr>
+            <w:proofErr w:type="gramStart"/>
+            <w:proofErr w:type="gramEnd"/>
+            <w:proofErr w:type="spellStart"/>
+            <w:proofErr w:type="gramStart"/>
+            <w:proofErr w:type="spellEnd"/>
+            <w:proofErr w:type="gramEnd"/>
             <w:r>
               <w:rPr>
                 <w:b/>
@@ -250,32 +249,19 @@
               <w:t xml:space="preserve">5. </w:t>
             </w:r>
             <w:r>
-              <w:t xml:space="preserve">To begin with, cultural exchange </w:t>
-            </w:r>
-            <w:proofErr w:type="spellStart"/>
-            <w:r>
-              <w:t>programme</w:t>
-            </w:r>
-            <w:proofErr w:type="spellEnd"/>
-            <w:r>
-              <w:t xml:space="preserve"> </w:t>
-            </w:r>
-            <w:proofErr w:type="gramStart"/>
-            <w:r>
-              <w:t>offer</w:t>
-            </w:r>
-            <w:proofErr w:type="gramEnd"/>
-            <w:r>
-              <w:t xml:space="preserve"> student</w:t>
-            </w:r>
-            <w:r>
-              <w:t>s</w:t>
-            </w:r>
-            <w:r>
-              <w:t xml:space="preserve"> golden opportunity to broaden their horizon.</w:t>
+              <w:t>School libraries serve as a powerful mean of encourage students to read, which enables them to become lifelong learners.</w:t>
             </w:r>
           </w:p>
           <w:p>
+            <w:pPr>
+              <w:spacing w:before="240"/>
+            </w:pPr>
+            <w:proofErr w:type="gramStart"/>
+            <w:proofErr w:type="gramEnd"/>
+            <w:proofErr w:type="spellStart"/>
+            <w:proofErr w:type="gramStart"/>
+            <w:proofErr w:type="spellEnd"/>
+            <w:proofErr w:type="gramEnd"/>
             <w:r>
               <w:rPr>
                 <w:b/>
@@ -283,95 +269,7 @@
               <w:t xml:space="preserve">6. </w:t>
             </w:r>
             <w:r>
-              <w:t>Furthermore</w:t>
-            </w:r>
-            <w:r>
-              <w:t xml:space="preserve">, joining the school choir offer teenagers a </w:t>
-            </w:r>
-            <w:r>
-              <w:t>valuable change</w:t>
-            </w:r>
-            <w:r>
-              <w:t xml:space="preserve"> to make new friends, </w:t>
-            </w:r>
-            <w:r>
-              <w:t>which in turn boost their confidence.</w:t>
-            </w:r>
-          </w:p>
-          <w:p>
-            <w:r>
-              <w:rPr>
-                <w:b/>
-              </w:rPr>
-              <w:t xml:space="preserve">7. </w:t>
-            </w:r>
-            <w:r>
-              <w:t xml:space="preserve">From the perspective of parents, school counselling services allow </w:t>
-            </w:r>
-            <w:r>
-              <w:t xml:space="preserve">it </w:t>
-            </w:r>
-            <w:r>
-              <w:t>to understand their children better, which in turn strengthen family relationships.</w:t>
-            </w:r>
-          </w:p>
-          <w:p>
-            <w:r>
-              <w:rPr>
-                <w:b/>
-              </w:rPr>
-              <w:t xml:space="preserve">8. </w:t>
-            </w:r>
-            <w:r>
-              <w:t>School libraries serve as a powerful mean of encourage students to read, which enables them to become lifelong learners.</w:t>
-            </w:r>
-          </w:p>
-          <w:p>
-            <w:r>
-              <w:rPr>
-                <w:b/>
-              </w:rPr>
-              <w:t xml:space="preserve">9. </w:t>
-            </w:r>
-            <w:r>
-              <w:t>Admittedly, e-books are more convenien</w:t>
-            </w:r>
-            <w:r>
-              <w:t>ce;</w:t>
-            </w:r>
-            <w:r>
-              <w:t xml:space="preserve"> nevertheless, printed books remain irreplaceable, as reading on paper help readers to concentrate better.</w:t>
-            </w:r>
-          </w:p>
-          <w:p>
-            <w:r>
-              <w:rPr>
-                <w:b/>
-              </w:rPr>
-              <w:t xml:space="preserve">10. </w:t>
-            </w:r>
-            <w:r>
-              <w:t xml:space="preserve">It is undeniable that a balanced diet </w:t>
-            </w:r>
-            <w:proofErr w:type="gramStart"/>
-            <w:r>
-              <w:t>play</w:t>
-            </w:r>
-            <w:proofErr w:type="gramEnd"/>
-            <w:r>
-              <w:t xml:space="preserve"> a pivot</w:t>
-            </w:r>
-            <w:r>
-              <w:t>al</w:t>
-            </w:r>
-            <w:r>
-              <w:t xml:space="preserve"> role in maintaining student’</w:t>
-            </w:r>
-            <w:r>
-              <w:t>s</w:t>
-            </w:r>
-            <w:r>
-              <w:t xml:space="preserve"> health.</w:t>
+              <w:t>Admittedly, e-books are more convenience; nevertheless, printed books remain irreplaceable, as reading on paper help readers to concentrate better.</w:t>
             </w:r>
           </w:p>
         </w:tc>
@@ -568,94 +466,6 @@
           <w:p/>
         </w:tc>
       </w:tr>
-      <w:tr>
-        <w:tc>
-          <w:tcPr>
-            <w:tcW w:type="dxa" w:w="567"/>
-          </w:tcPr>
-          <w:p>
-            <w:r>
-              <w:rPr>
-                <w:b/>
-              </w:rPr>
-              <w:t>7.</w:t>
-            </w:r>
-          </w:p>
-        </w:tc>
-        <w:tc>
-          <w:tcPr>
-            <w:tcW w:type="dxa" w:w="9071"/>
-          </w:tcPr>
-          <w:p/>
-          <w:p/>
-        </w:tc>
-      </w:tr>
-      <w:tr>
-        <w:tc>
-          <w:tcPr>
-            <w:tcW w:type="dxa" w:w="567"/>
-          </w:tcPr>
-          <w:p>
-            <w:r>
-              <w:rPr>
-                <w:b/>
-              </w:rPr>
-              <w:t>8.</w:t>
-            </w:r>
-          </w:p>
-        </w:tc>
-        <w:tc>
-          <w:tcPr>
-            <w:tcW w:type="dxa" w:w="9071"/>
-          </w:tcPr>
-          <w:p/>
-          <w:p/>
-        </w:tc>
-      </w:tr>
-      <w:tr>
-        <w:tc>
-          <w:tcPr>
-            <w:tcW w:type="dxa" w:w="567"/>
-          </w:tcPr>
-          <w:p>
-            <w:r>
-              <w:rPr>
-                <w:b/>
-              </w:rPr>
-              <w:t>9.</w:t>
-            </w:r>
-          </w:p>
-        </w:tc>
-        <w:tc>
-          <w:tcPr>
-            <w:tcW w:type="dxa" w:w="9071"/>
-          </w:tcPr>
-          <w:p/>
-          <w:p/>
-        </w:tc>
-      </w:tr>
-      <w:tr>
-        <w:tc>
-          <w:tcPr>
-            <w:tcW w:type="dxa" w:w="567"/>
-          </w:tcPr>
-          <w:p>
-            <w:r>
-              <w:rPr>
-                <w:b/>
-              </w:rPr>
-              <w:t>10.</w:t>
-            </w:r>
-          </w:p>
-        </w:tc>
-        <w:tc>
-          <w:tcPr>
-            <w:tcW w:type="dxa" w:w="9071"/>
-          </w:tcPr>
-          <w:p/>
-          <w:p/>
-        </w:tc>
-      </w:tr>
     </w:tbl>
     <w:p>
       <w:pPr>
@@ -675,119 +485,13 @@
     </w:p>
     <w:p>
       <w:pPr>
-        <w:spacing w:after="0"/>
-        <w:ind w:left="227"/>
-      </w:pPr>
-      <w:r>
-        <w:rPr>
-          <w:b w:val="0"/>
-        </w:rPr>
-        <w:t xml:space="preserve">In the paragraph that suggests solutions, most students write </w:t>
-      </w:r>
-      <w:r>
-        <w:rPr>
-          <w:b/>
-        </w:rPr>
-        <w:t>“Schools can …”</w:t>
-      </w:r>
-      <w:r>
-        <w:rPr>
-          <w:b w:val="0"/>
-        </w:rPr>
-        <w:t xml:space="preserve">, </w:t>
-      </w:r>
-      <w:r>
-        <w:rPr>
-          <w:b/>
-        </w:rPr>
-        <w:t>“The government can …”</w:t>
-      </w:r>
-      <w:r>
-        <w:rPr>
-          <w:b w:val="0"/>
-        </w:rPr>
-        <w:t xml:space="preserve"> and </w:t>
-      </w:r>
-      <w:r>
-        <w:rPr>
-          <w:b/>
-        </w:rPr>
-        <w:t>“Parents can …”</w:t>
-      </w:r>
-      <w:r>
-        <w:rPr>
-          <w:b w:val="0"/>
-        </w:rPr>
-        <w:t>. These sentences are correct, but they are plain. This part upgrades the WORDS you use, and Part C shows you the three sentence patterns that upgrade the sentences themselves.</w:t>
-      </w:r>
-    </w:p>
-    <w:p>
-      <w:r>
-        <w:rPr>
-          <w:b/>
-        </w:rPr>
-        <w:t xml:space="preserve">Topic for this part: </w:t>
-      </w:r>
-      <w:r>
-        <w:t>boost the physical fitness and awareness of citizens</w:t>
-      </w:r>
-    </w:p>
-    <w:tbl>
-      <w:tblPr>
-        <w:tblStyle w:val="TableGrid"/>
-        <w:tblW w:w="0" w:type="auto"/>
-        <w:tblLayout w:type="fixed"/>
-        <w:tblLook w:val="04A0" w:firstRow="1" w:lastRow="0" w:firstColumn="1" w:lastColumn="0" w:noHBand="0" w:noVBand="1"/>
-      </w:tblPr>
-      <w:tblGrid>
-        <w:gridCol w:w="9638"/>
-      </w:tblGrid>
-      <w:tr>
-        <w:tc>
-          <w:tcPr>
-            <w:tcW w:w="9638" w:type="dxa"/>
-            <w:shd w:val="clear" w:color="auto" w:fill="D9D9D9"/>
-          </w:tcPr>
-          <w:p>
-            <w:r>
-              <w:rPr>
-                <w:b/>
-              </w:rPr>
-              <w:t>LEVEL 3 — THE BASIC SENTENCES STUDENTS USUALLY WRITE</w:t>
-            </w:r>
-          </w:p>
-          <w:p>
-            <w:r>
-              <w:t>The government can build more sports facilities.</w:t>
-            </w:r>
-          </w:p>
-          <w:p>
-            <w:r>
-              <w:t>Schools can organise more sports activities and sports days.</w:t>
-            </w:r>
-          </w:p>
-          <w:p>
-            <w:r>
-              <w:t>Parents can exercise with their children at weekends.</w:t>
-            </w:r>
-          </w:p>
-        </w:tc>
-      </w:tr>
-    </w:tbl>
-    <w:p>
-      <w:pPr>
-        <w:spacing w:after="0"/>
-      </w:pPr>
-    </w:p>
-    <w:p>
-      <w:pPr>
         <w:spacing w:before="160" w:after="120"/>
       </w:pPr>
       <w:r>
         <w:rPr>
           <w:b/>
         </w:rPr>
-        <w:t>LEVEL 3 → LEVEL 5 VOCABULARY (physical fitness and awareness)</w:t>
+        <w:t>LEVEL 3 → LEVEL 5 VOCABULARY</w:t>
       </w:r>
     </w:p>
     <w:tbl>
@@ -866,7 +570,7 @@
           </w:tcPr>
           <w:p>
             <w:r>
-              <w:t>make people healthier</w:t>
+              <w:t>not sleep enough</w:t>
             </w:r>
           </w:p>
         </w:tc>
@@ -898,7 +602,7 @@
           </w:tcPr>
           <w:p>
             <w:r>
-              <w:t>tell people about the importance of exercise</w:t>
+              <w:t>throw away food</w:t>
             </w:r>
           </w:p>
         </w:tc>
@@ -930,7 +634,7 @@
           </w:tcPr>
           <w:p>
             <w:r>
-              <w:t>do exercise</w:t>
+              <w:t>say bad things to people online</w:t>
             </w:r>
           </w:p>
         </w:tc>
@@ -962,7 +666,7 @@
           </w:tcPr>
           <w:p>
             <w:r>
-              <w:t>build more sports places</w:t>
+              <w:t>feel sad and worried</w:t>
             </w:r>
           </w:p>
         </w:tc>
@@ -994,7 +698,39 @@
           </w:tcPr>
           <w:p>
             <w:r>
-              <w:t>stop people from being lazy</w:t>
+              <w:t>read fewer books</w:t>
+            </w:r>
+          </w:p>
+        </w:tc>
+        <w:tc>
+          <w:tcPr>
+            <w:tcW w:w="5783" w:type="dxa"/>
+          </w:tcPr>
+          <w:p/>
+          <w:p/>
+        </w:tc>
+      </w:tr>
+      <w:tr>
+        <w:tc>
+          <w:tcPr>
+            <w:tcW w:w="454" w:type="dxa"/>
+          </w:tcPr>
+          <w:p>
+            <w:r>
+              <w:rPr>
+                <w:b/>
+              </w:rPr>
+              <w:t>6</w:t>
+            </w:r>
+          </w:p>
+        </w:tc>
+        <w:tc>
+          <w:tcPr>
+            <w:tcW w:w="3402" w:type="dxa"/>
+          </w:tcPr>
+          <w:p>
+            <w:r>
+              <w:t>old people feel lonely</w:t>
             </w:r>
           </w:p>
         </w:tc>
@@ -1027,6 +763,64 @@
         </w:rPr>
         <w:t>PART C: UPGRADING SENTENCE</w:t>
       </w:r>
+    </w:p>
+    <w:p>
+      <w:r>
+        <w:rPr>
+          <w:b/>
+        </w:rPr>
+        <w:t xml:space="preserve">Topic for this part: </w:t>
+      </w:r>
+      <w:r>
+        <w:t>boost the physical fitness and awareness of citizens</w:t>
+      </w:r>
+    </w:p>
+    <w:tbl>
+      <w:tblPr>
+        <w:tblStyle w:val="TableGrid"/>
+        <w:tblW w:w="0" w:type="auto"/>
+        <w:tblLayout w:type="fixed"/>
+        <w:tblLook w:val="04A0" w:firstRow="1" w:lastRow="0" w:firstColumn="1" w:lastColumn="0" w:noHBand="0" w:noVBand="1"/>
+      </w:tblPr>
+      <w:tblGrid>
+        <w:gridCol w:w="9638"/>
+      </w:tblGrid>
+      <w:tr>
+        <w:tc>
+          <w:tcPr>
+            <w:tcW w:w="9638" w:type="dxa"/>
+            <w:shd w:val="clear" w:color="auto" w:fill="D9D9D9"/>
+          </w:tcPr>
+          <w:p>
+            <w:r>
+              <w:rPr>
+                <w:b/>
+              </w:rPr>
+              <w:t>LEVEL 3 — THE BASIC SENTENCES STUDENTS USUALLY WRITE</w:t>
+            </w:r>
+          </w:p>
+          <w:p>
+            <w:r>
+              <w:t>The government can build more sports facilities.</w:t>
+            </w:r>
+          </w:p>
+          <w:p>
+            <w:r>
+              <w:t>Schools can organise more sports activities and sports days.</w:t>
+            </w:r>
+          </w:p>
+          <w:p>
+            <w:r>
+              <w:t>Parents can exercise with their children at weekends.</w:t>
+            </w:r>
+          </w:p>
+        </w:tc>
+      </w:tr>
+    </w:tbl>
+    <w:p>
+      <w:pPr>
+        <w:spacing w:after="0"/>
+      </w:pPr>
     </w:p>
     <w:tbl>
       <w:tblPr>
@@ -1065,11 +859,6 @@
         </w:tc>
       </w:tr>
     </w:tbl>
-    <w:p>
-      <w:pPr>
-        <w:spacing w:after="0"/>
-      </w:pPr>
-    </w:p>
     <w:tbl>
       <w:tblPr>
         <w:tblStyle w:val="TableGrid"/>

</xml_diff>

<commit_message>
Rev 9: students' version built from Helen's finalised teacher's file; teacher file updated to her final version
</commit_message>
<xml_diff>
--- a/6B Grammar Lesson 3 - Discussing Solutions (Students).docx
+++ b/6B Grammar Lesson 3 - Discussing Solutions (Students).docx
@@ -16,7 +16,7 @@
           <w:lang w:eastAsia="zh-TW"/>
         </w:rPr>
         <w:drawing>
-          <wp:anchor distT="0" distB="0" distL="114300" distR="114300" simplePos="0" relativeHeight="251658240" behindDoc="0" locked="0" layoutInCell="1" allowOverlap="1" wp14:anchorId="003A5E46" wp14:editId="44817612">
+          <wp:anchor distT="0" distB="0" distL="114300" distR="114300" simplePos="0" relativeHeight="251658240" behindDoc="0" locked="0" layoutInCell="1" allowOverlap="1" wp14:anchorId="40B87859" wp14:editId="7FEDB476">
             <wp:simplePos x="0" y="0"/>
             <wp:positionH relativeFrom="column">
               <wp:posOffset>4275438</wp:posOffset>
@@ -131,10 +131,7 @@
     </w:p>
     <w:p>
       <w:r>
-        <w:t xml:space="preserve">Proofread the following sentences. </w:t>
-      </w:r>
-      <w:r>
-        <w:t xml:space="preserve">Each sentence contains TWO errors. </w:t>
+        <w:t xml:space="preserve">Proofread the following sentences. Each sentence contains TWO errors. </w:t>
       </w:r>
     </w:p>
     <w:tbl>
@@ -156,12 +153,6 @@
             <w:pPr>
               <w:spacing w:before="240"/>
             </w:pPr>
-            <w:proofErr w:type="gramStart"/>
-            <w:proofErr w:type="gramEnd"/>
-            <w:proofErr w:type="spellStart"/>
-            <w:proofErr w:type="gramStart"/>
-            <w:proofErr w:type="spellEnd"/>
-            <w:proofErr w:type="gramEnd"/>
             <w:r>
               <w:rPr>
                 <w:b/>
@@ -176,12 +167,6 @@
             <w:pPr>
               <w:spacing w:before="240"/>
             </w:pPr>
-            <w:proofErr w:type="gramStart"/>
-            <w:proofErr w:type="gramEnd"/>
-            <w:proofErr w:type="spellStart"/>
-            <w:proofErr w:type="gramStart"/>
-            <w:proofErr w:type="spellEnd"/>
-            <w:proofErr w:type="gramEnd"/>
             <w:r>
               <w:rPr>
                 <w:b/>
@@ -196,12 +181,6 @@
             <w:pPr>
               <w:spacing w:before="240"/>
             </w:pPr>
-            <w:proofErr w:type="gramStart"/>
-            <w:proofErr w:type="gramEnd"/>
-            <w:proofErr w:type="spellStart"/>
-            <w:proofErr w:type="gramStart"/>
-            <w:proofErr w:type="spellEnd"/>
-            <w:proofErr w:type="gramEnd"/>
             <w:r>
               <w:rPr>
                 <w:b/>
@@ -216,12 +195,6 @@
             <w:pPr>
               <w:spacing w:before="240"/>
             </w:pPr>
-            <w:proofErr w:type="gramStart"/>
-            <w:proofErr w:type="gramEnd"/>
-            <w:proofErr w:type="spellStart"/>
-            <w:proofErr w:type="gramStart"/>
-            <w:proofErr w:type="spellEnd"/>
-            <w:proofErr w:type="gramEnd"/>
             <w:r>
               <w:rPr>
                 <w:b/>
@@ -236,12 +209,6 @@
             <w:pPr>
               <w:spacing w:before="240"/>
             </w:pPr>
-            <w:proofErr w:type="gramStart"/>
-            <w:proofErr w:type="gramEnd"/>
-            <w:proofErr w:type="spellStart"/>
-            <w:proofErr w:type="gramStart"/>
-            <w:proofErr w:type="spellEnd"/>
-            <w:proofErr w:type="gramEnd"/>
             <w:r>
               <w:rPr>
                 <w:b/>
@@ -256,12 +223,6 @@
             <w:pPr>
               <w:spacing w:before="240"/>
             </w:pPr>
-            <w:proofErr w:type="gramStart"/>
-            <w:proofErr w:type="gramEnd"/>
-            <w:proofErr w:type="spellStart"/>
-            <w:proofErr w:type="gramStart"/>
-            <w:proofErr w:type="spellEnd"/>
-            <w:proofErr w:type="gramEnd"/>
             <w:r>
               <w:rPr>
                 <w:b/>
@@ -483,28 +444,17 @@
         <w:t>PART B: UPGRADING VOCABULARY</w:t>
       </w:r>
     </w:p>
-    <w:p>
-      <w:pPr>
-        <w:spacing w:before="160" w:after="120"/>
-      </w:pPr>
-      <w:r>
-        <w:rPr>
-          <w:b/>
-        </w:rPr>
-        <w:t>LEVEL 3 → LEVEL 5 VOCABULARY</w:t>
-      </w:r>
-    </w:p>
     <w:tbl>
       <w:tblPr>
         <w:tblStyle w:val="TableGrid"/>
-        <w:tblW w:w="0" w:type="auto"/>
+        <w:tblW w:w="9639" w:type="dxa"/>
         <w:tblLayout w:type="fixed"/>
         <w:tblLook w:val="04A0" w:firstRow="1" w:lastRow="0" w:firstColumn="1" w:lastColumn="0" w:noHBand="0" w:noVBand="1"/>
       </w:tblPr>
       <w:tblGrid>
         <w:gridCol w:w="454"/>
-        <w:gridCol w:w="3402"/>
-        <w:gridCol w:w="5783"/>
+        <w:gridCol w:w="5031"/>
+        <w:gridCol w:w="4154"/>
       </w:tblGrid>
       <w:tr>
         <w:tc>
@@ -523,7 +473,7 @@
         </w:tc>
         <w:tc>
           <w:tcPr>
-            <w:tcW w:w="3402" w:type="dxa"/>
+            <w:tcW w:w="5031" w:type="dxa"/>
             <w:shd w:val="clear" w:color="auto" w:fill="D9D9D9"/>
           </w:tcPr>
           <w:p>
@@ -531,13 +481,13 @@
               <w:rPr>
                 <w:b/>
               </w:rPr>
-              <w:t>Level 3 (what students write)</w:t>
+              <w:t>Basic</w:t>
             </w:r>
           </w:p>
         </w:tc>
         <w:tc>
           <w:tcPr>
-            <w:tcW w:w="5783" w:type="dxa"/>
+            <w:tcW w:w="4154" w:type="dxa"/>
             <w:shd w:val="clear" w:color="auto" w:fill="D9D9D9"/>
           </w:tcPr>
           <w:p>
@@ -545,7 +495,7 @@
               <w:rPr>
                 <w:b/>
               </w:rPr>
-              <w:t>Your Level 5 upgrade (upgrade the Level 3 phrase)</w:t>
+              <w:t>Upgraded</w:t>
             </w:r>
           </w:p>
         </w:tc>
@@ -566,17 +516,34 @@
         </w:tc>
         <w:tc>
           <w:tcPr>
-            <w:tcW w:w="3402" w:type="dxa"/>
+            <w:tcW w:w="5031" w:type="dxa"/>
           </w:tcPr>
           <w:p>
             <w:r>
-              <w:t>not sleep enough</w:t>
+              <w:rPr>
+                <w:i/>
+              </w:rPr>
+              <w:t xml:space="preserve">Many teenagers </w:t>
+            </w:r>
+            <w:r>
+              <w:rPr>
+                <w:i/>
+                <w:u w:val="single"/>
+              </w:rPr>
+              <w:t>do not sleep enough</w:t>
+            </w:r>
+            <w:r>
+              <w:rPr>
+                <w:i/>
+              </w:rPr>
+              <w:t xml:space="preserve"> during the examination period.</w:t>
             </w:r>
           </w:p>
+          <w:p/>
         </w:tc>
         <w:tc>
           <w:tcPr>
-            <w:tcW w:w="5783" w:type="dxa"/>
+            <w:tcW w:w="4154" w:type="dxa"/>
           </w:tcPr>
           <w:p/>
           <w:p/>
@@ -598,17 +565,39 @@
         </w:tc>
         <w:tc>
           <w:tcPr>
-            <w:tcW w:w="3402" w:type="dxa"/>
+            <w:tcW w:w="5031" w:type="dxa"/>
           </w:tcPr>
           <w:p>
+            <w:pPr>
+              <w:rPr>
+                <w:i/>
+              </w:rPr>
+            </w:pPr>
             <w:r>
-              <w:t>throw away food</w:t>
+              <w:rPr>
+                <w:i/>
+              </w:rPr>
+              <w:t xml:space="preserve">Canteens can </w:t>
+            </w:r>
+            <w:r>
+              <w:rPr>
+                <w:i/>
+                <w:u w:val="single"/>
+              </w:rPr>
+              <w:t>stop throwing food away</w:t>
+            </w:r>
+            <w:r>
+              <w:rPr>
+                <w:i/>
+              </w:rPr>
+              <w:t xml:space="preserve"> by serving smaller portions.</w:t>
             </w:r>
           </w:p>
+          <w:p/>
         </w:tc>
         <w:tc>
           <w:tcPr>
-            <w:tcW w:w="5783" w:type="dxa"/>
+            <w:tcW w:w="4154" w:type="dxa"/>
           </w:tcPr>
           <w:p/>
           <w:p/>
@@ -630,17 +619,39 @@
         </w:tc>
         <w:tc>
           <w:tcPr>
-            <w:tcW w:w="3402" w:type="dxa"/>
+            <w:tcW w:w="5031" w:type="dxa"/>
           </w:tcPr>
           <w:p>
+            <w:pPr>
+              <w:rPr>
+                <w:i/>
+              </w:rPr>
+            </w:pPr>
             <w:r>
-              <w:t>say bad things to people online</w:t>
+              <w:rPr>
+                <w:i/>
+                <w:u w:val="single"/>
+              </w:rPr>
+              <w:t>Saying bad things to people</w:t>
+            </w:r>
+            <w:r>
+              <w:rPr>
+                <w:i/>
+              </w:rPr>
+              <w:t xml:space="preserve"> online</w:t>
+            </w:r>
+            <w:r>
+              <w:rPr>
+                <w:i/>
+              </w:rPr>
+              <w:t xml:space="preserve"> can destroy a teenager’s confidence.</w:t>
             </w:r>
           </w:p>
+          <w:p/>
         </w:tc>
         <w:tc>
           <w:tcPr>
-            <w:tcW w:w="5783" w:type="dxa"/>
+            <w:tcW w:w="4154" w:type="dxa"/>
           </w:tcPr>
           <w:p/>
           <w:p/>
@@ -662,17 +673,33 @@
         </w:tc>
         <w:tc>
           <w:tcPr>
-            <w:tcW w:w="3402" w:type="dxa"/>
+            <w:tcW w:w="5031" w:type="dxa"/>
           </w:tcPr>
           <w:p>
             <w:r>
-              <w:t>feel sad and worried</w:t>
+              <w:rPr>
+                <w:i/>
+              </w:rPr>
+              <w:t xml:space="preserve">Many young people </w:t>
+            </w:r>
+            <w:r>
+              <w:rPr>
+                <w:i/>
+                <w:u w:val="single"/>
+              </w:rPr>
+              <w:t>feel worried</w:t>
+            </w:r>
+            <w:r>
+              <w:rPr>
+                <w:i/>
+              </w:rPr>
+              <w:t xml:space="preserve"> in silence.</w:t>
             </w:r>
           </w:p>
         </w:tc>
         <w:tc>
           <w:tcPr>
-            <w:tcW w:w="5783" w:type="dxa"/>
+            <w:tcW w:w="4154" w:type="dxa"/>
           </w:tcPr>
           <w:p/>
           <w:p/>
@@ -694,17 +721,51 @@
         </w:tc>
         <w:tc>
           <w:tcPr>
-            <w:tcW w:w="3402" w:type="dxa"/>
+            <w:tcW w:w="5031" w:type="dxa"/>
           </w:tcPr>
           <w:p>
+            <w:pPr>
+              <w:rPr>
+                <w:i/>
+              </w:rPr>
+            </w:pPr>
             <w:r>
+              <w:rPr>
+                <w:i/>
+              </w:rPr>
+              <w:t xml:space="preserve">Teenagers who </w:t>
+            </w:r>
+            <w:r>
+              <w:rPr>
+                <w:i/>
+                <w:u w:val="single"/>
+              </w:rPr>
               <w:t>read fewer books</w:t>
             </w:r>
+            <w:r>
+              <w:rPr>
+                <w:i/>
+              </w:rPr>
+              <w:t xml:space="preserve"> rarely pick </w:t>
+            </w:r>
+            <w:r>
+              <w:rPr>
+                <w:i/>
+              </w:rPr>
+              <w:t xml:space="preserve">that </w:t>
+            </w:r>
+            <w:r>
+              <w:rPr>
+                <w:i/>
+              </w:rPr>
+              <w:t>up again.</w:t>
+            </w:r>
           </w:p>
+          <w:p/>
         </w:tc>
         <w:tc>
           <w:tcPr>
-            <w:tcW w:w="5783" w:type="dxa"/>
+            <w:tcW w:w="4154" w:type="dxa"/>
           </w:tcPr>
           <w:p/>
           <w:p/>
@@ -726,17 +787,41 @@
         </w:tc>
         <w:tc>
           <w:tcPr>
-            <w:tcW w:w="3402" w:type="dxa"/>
+            <w:tcW w:w="5031" w:type="dxa"/>
           </w:tcPr>
           <w:p>
             <w:r>
-              <w:t>old people feel lonely</w:t>
+              <w:rPr>
+                <w:i/>
+                <w:u w:val="single"/>
+              </w:rPr>
+              <w:t xml:space="preserve">Old people </w:t>
+            </w:r>
+            <w:r>
+              <w:rPr>
+                <w:i/>
+                <w:u w:val="single"/>
+              </w:rPr>
+              <w:t>usually</w:t>
+            </w:r>
+            <w:r>
+              <w:rPr>
+                <w:i/>
+                <w:u w:val="single"/>
+              </w:rPr>
+              <w:t xml:space="preserve"> feel lonely</w:t>
+            </w:r>
+            <w:r>
+              <w:rPr>
+                <w:i/>
+              </w:rPr>
+              <w:t xml:space="preserve"> after they retire.</w:t>
             </w:r>
           </w:p>
         </w:tc>
         <w:tc>
           <w:tcPr>
-            <w:tcW w:w="5783" w:type="dxa"/>
+            <w:tcW w:w="4154" w:type="dxa"/>
           </w:tcPr>
           <w:p/>
           <w:p/>
@@ -747,11 +832,6 @@
       <w:pPr>
         <w:spacing w:after="0"/>
       </w:pPr>
-      <w:r>
-        <w:rPr>
-          <w:b w:val="0"/>
-        </w:rPr>
-      </w:r>
     </w:p>
     <w:p>
       <w:pPr>
@@ -762,17 +842,6 @@
           <w:b/>
         </w:rPr>
         <w:t>PART C: UPGRADING SENTENCE</w:t>
-      </w:r>
-    </w:p>
-    <w:p>
-      <w:r>
-        <w:rPr>
-          <w:b/>
-        </w:rPr>
-        <w:t xml:space="preserve">Topic for this part: </w:t>
-      </w:r>
-      <w:r>
-        <w:t>boost the physical fitness and awareness of citizens</w:t>
       </w:r>
     </w:p>
     <w:tbl>
@@ -792,24 +861,36 @@
             <w:shd w:val="clear" w:color="auto" w:fill="D9D9D9"/>
           </w:tcPr>
           <w:p>
+            <w:pPr>
+              <w:spacing w:line="360" w:lineRule="auto"/>
+            </w:pPr>
             <w:r>
               <w:rPr>
                 <w:b/>
               </w:rPr>
-              <w:t>LEVEL 3 — THE BASIC SENTENCES STUDENTS USUALLY WRITE</w:t>
+              <w:t>THE BASIC SENTENCES STUDENTS USUALLY WRITE</w:t>
             </w:r>
           </w:p>
           <w:p>
+            <w:pPr>
+              <w:spacing w:line="360" w:lineRule="auto"/>
+            </w:pPr>
             <w:r>
               <w:t>The government can build more sports facilities.</w:t>
             </w:r>
           </w:p>
           <w:p>
+            <w:pPr>
+              <w:spacing w:line="360" w:lineRule="auto"/>
+            </w:pPr>
             <w:r>
               <w:t>Schools can organise more sports activities and sports days.</w:t>
             </w:r>
           </w:p>
           <w:p>
+            <w:pPr>
+              <w:spacing w:line="360" w:lineRule="auto"/>
+            </w:pPr>
             <w:r>
               <w:t>Parents can exercise with their children at weekends.</w:t>
             </w:r>
@@ -830,14 +911,19 @@
         <w:tblLook w:val="04A0" w:firstRow="1" w:lastRow="0" w:firstColumn="1" w:lastColumn="0" w:noHBand="0" w:noVBand="1"/>
       </w:tblPr>
       <w:tblGrid>
-        <w:gridCol w:w="9638"/>
+        <w:gridCol w:w="1548"/>
+        <w:gridCol w:w="8090"/>
       </w:tblGrid>
       <w:tr>
         <w:tc>
           <w:tcPr>
             <w:tcW w:w="9638" w:type="dxa"/>
+            <w:gridSpan w:val="2"/>
           </w:tcPr>
           <w:p>
+            <w:pPr>
+              <w:spacing w:line="360" w:lineRule="auto"/>
+            </w:pPr>
             <w:r>
               <w:rPr>
                 <w:b/>
@@ -846,6 +932,9 @@
             </w:r>
           </w:p>
           <w:p>
+            <w:pPr>
+              <w:spacing w:line="360" w:lineRule="auto"/>
+            </w:pPr>
             <w:r>
               <w:rPr>
                 <w:b/>
@@ -858,29 +947,26 @@
           </w:p>
         </w:tc>
       </w:tr>
-    </w:tbl>
-    <w:tbl>
-      <w:tblPr>
-        <w:tblStyle w:val="TableGrid"/>
-        <w:tblW w:w="0" w:type="auto"/>
-        <w:tblLayout w:type="fixed"/>
-        <w:tblLook w:val="04A0" w:firstRow="1" w:lastRow="0" w:firstColumn="1" w:lastColumn="0" w:noHBand="0" w:noVBand="1"/>
-      </w:tblPr>
-      <w:tblGrid>
-        <w:gridCol w:w="1548"/>
-        <w:gridCol w:w="8090"/>
-      </w:tblGrid>
       <w:tr>
         <w:tc>
           <w:tcPr>
             <w:tcW w:w="1548" w:type="dxa"/>
           </w:tcPr>
           <w:p>
+            <w:pPr>
+              <w:spacing w:line="360" w:lineRule="auto"/>
+            </w:pPr>
             <w:r>
               <w:rPr>
                 <w:b/>
               </w:rPr>
-              <w:t>Level 3:</w:t>
+              <w:t>Basic</w:t>
+            </w:r>
+            <w:r>
+              <w:rPr>
+                <w:b/>
+              </w:rPr>
+              <w:t>:</w:t>
             </w:r>
           </w:p>
         </w:tc>
@@ -889,6 +975,9 @@
             <w:tcW w:w="8090" w:type="dxa"/>
           </w:tcPr>
           <w:p>
+            <w:pPr>
+              <w:spacing w:line="360" w:lineRule="auto"/>
+            </w:pPr>
             <w:r>
               <w:t>The government can build more sports facilities.</w:t>
             </w:r>
@@ -901,11 +990,20 @@
             <w:tcW w:w="1548" w:type="dxa"/>
           </w:tcPr>
           <w:p>
+            <w:pPr>
+              <w:spacing w:line="360" w:lineRule="auto"/>
+            </w:pPr>
             <w:r>
               <w:rPr>
                 <w:b/>
               </w:rPr>
-              <w:t>Level 5:</w:t>
+              <w:t>Upgraded</w:t>
+            </w:r>
+            <w:r>
+              <w:rPr>
+                <w:b/>
+              </w:rPr>
+              <w:t>:</w:t>
             </w:r>
           </w:p>
         </w:tc>
@@ -914,6 +1012,9 @@
             <w:tcW w:w="8090" w:type="dxa"/>
           </w:tcPr>
           <w:p>
+            <w:pPr>
+              <w:spacing w:line="360" w:lineRule="auto"/>
+            </w:pPr>
             <w:r>
               <w:rPr>
                 <w:b/>
@@ -939,27 +1040,36 @@
     <w:tbl>
       <w:tblPr>
         <w:tblStyle w:val="TableGrid"/>
-        <w:tblW w:w="0" w:type="auto"/>
+        <w:tblW w:w="9638" w:type="dxa"/>
         <w:tblLayout w:type="fixed"/>
         <w:tblLook w:val="04A0" w:firstRow="1" w:lastRow="0" w:firstColumn="1" w:lastColumn="0" w:noHBand="0" w:noVBand="1"/>
       </w:tblPr>
       <w:tblGrid>
-        <w:gridCol w:w="9638"/>
+        <w:gridCol w:w="1548"/>
+        <w:gridCol w:w="8090"/>
       </w:tblGrid>
       <w:tr>
         <w:tc>
           <w:tcPr>
             <w:tcW w:w="9638" w:type="dxa"/>
+            <w:gridSpan w:val="2"/>
           </w:tcPr>
           <w:p>
+            <w:pPr>
+              <w:spacing w:line="360" w:lineRule="auto"/>
+            </w:pPr>
             <w:r>
               <w:rPr>
                 <w:b/>
               </w:rPr>
+              <w:lastRenderedPageBreak/>
               <w:t>Pattern 2 — Purpose-First Recommendation</w:t>
             </w:r>
           </w:p>
           <w:p>
+            <w:pPr>
+              <w:spacing w:line="360" w:lineRule="auto"/>
+            </w:pPr>
             <w:r>
               <w:rPr>
                 <w:b/>
@@ -972,29 +1082,20 @@
           </w:p>
         </w:tc>
       </w:tr>
-    </w:tbl>
-    <w:tbl>
-      <w:tblPr>
-        <w:tblStyle w:val="TableGrid"/>
-        <w:tblW w:w="0" w:type="auto"/>
-        <w:tblLayout w:type="fixed"/>
-        <w:tblLook w:val="04A0" w:firstRow="1" w:lastRow="0" w:firstColumn="1" w:lastColumn="0" w:noHBand="0" w:noVBand="1"/>
-      </w:tblPr>
-      <w:tblGrid>
-        <w:gridCol w:w="1548"/>
-        <w:gridCol w:w="8090"/>
-      </w:tblGrid>
       <w:tr>
         <w:tc>
           <w:tcPr>
             <w:tcW w:w="1548" w:type="dxa"/>
           </w:tcPr>
           <w:p>
+            <w:pPr>
+              <w:spacing w:line="360" w:lineRule="auto"/>
+            </w:pPr>
             <w:r>
               <w:rPr>
                 <w:b/>
               </w:rPr>
-              <w:t>Level 3:</w:t>
+              <w:t>Basic:</w:t>
             </w:r>
           </w:p>
         </w:tc>
@@ -1003,6 +1104,9 @@
             <w:tcW w:w="8090" w:type="dxa"/>
           </w:tcPr>
           <w:p>
+            <w:pPr>
+              <w:spacing w:line="360" w:lineRule="auto"/>
+            </w:pPr>
             <w:r>
               <w:t>Schools can organise more sports activities and sports days.</w:t>
             </w:r>
@@ -1015,11 +1119,14 @@
             <w:tcW w:w="1548" w:type="dxa"/>
           </w:tcPr>
           <w:p>
+            <w:pPr>
+              <w:spacing w:line="360" w:lineRule="auto"/>
+            </w:pPr>
             <w:r>
               <w:rPr>
                 <w:b/>
               </w:rPr>
-              <w:t>Level 5:</w:t>
+              <w:t>Upgraded:</w:t>
             </w:r>
           </w:p>
         </w:tc>
@@ -1028,6 +1135,9 @@
             <w:tcW w:w="8090" w:type="dxa"/>
           </w:tcPr>
           <w:p>
+            <w:pPr>
+              <w:spacing w:line="360" w:lineRule="auto"/>
+            </w:pPr>
             <w:r>
               <w:rPr>
                 <w:b/>
@@ -1053,19 +1163,24 @@
     <w:tbl>
       <w:tblPr>
         <w:tblStyle w:val="TableGrid"/>
-        <w:tblW w:w="0" w:type="auto"/>
+        <w:tblW w:w="9638" w:type="dxa"/>
         <w:tblLayout w:type="fixed"/>
         <w:tblLook w:val="04A0" w:firstRow="1" w:lastRow="0" w:firstColumn="1" w:lastColumn="0" w:noHBand="0" w:noVBand="1"/>
       </w:tblPr>
       <w:tblGrid>
-        <w:gridCol w:w="9638"/>
+        <w:gridCol w:w="1548"/>
+        <w:gridCol w:w="8090"/>
       </w:tblGrid>
       <w:tr>
         <w:tc>
           <w:tcPr>
             <w:tcW w:w="9638" w:type="dxa"/>
+            <w:gridSpan w:val="2"/>
           </w:tcPr>
           <w:p>
+            <w:pPr>
+              <w:spacing w:line="360" w:lineRule="auto"/>
+            </w:pPr>
             <w:r>
               <w:rPr>
                 <w:b/>
@@ -1074,6 +1189,9 @@
             </w:r>
           </w:p>
           <w:p>
+            <w:pPr>
+              <w:spacing w:line="360" w:lineRule="auto"/>
+            </w:pPr>
             <w:r>
               <w:rPr>
                 <w:b/>
@@ -1086,29 +1204,20 @@
           </w:p>
         </w:tc>
       </w:tr>
-    </w:tbl>
-    <w:tbl>
-      <w:tblPr>
-        <w:tblStyle w:val="TableGrid"/>
-        <w:tblW w:w="0" w:type="auto"/>
-        <w:tblLayout w:type="fixed"/>
-        <w:tblLook w:val="04A0" w:firstRow="1" w:lastRow="0" w:firstColumn="1" w:lastColumn="0" w:noHBand="0" w:noVBand="1"/>
-      </w:tblPr>
-      <w:tblGrid>
-        <w:gridCol w:w="1548"/>
-        <w:gridCol w:w="8090"/>
-      </w:tblGrid>
       <w:tr>
         <w:tc>
           <w:tcPr>
             <w:tcW w:w="1548" w:type="dxa"/>
           </w:tcPr>
           <w:p>
+            <w:pPr>
+              <w:spacing w:line="360" w:lineRule="auto"/>
+            </w:pPr>
             <w:r>
               <w:rPr>
                 <w:b/>
               </w:rPr>
-              <w:t>Level 3:</w:t>
+              <w:t>Basic:</w:t>
             </w:r>
           </w:p>
         </w:tc>
@@ -1117,6 +1226,9 @@
             <w:tcW w:w="8090" w:type="dxa"/>
           </w:tcPr>
           <w:p>
+            <w:pPr>
+              <w:spacing w:line="360" w:lineRule="auto"/>
+            </w:pPr>
             <w:r>
               <w:t>Parents can exercise with their children at weekends.</w:t>
             </w:r>
@@ -1129,11 +1241,14 @@
             <w:tcW w:w="1548" w:type="dxa"/>
           </w:tcPr>
           <w:p>
+            <w:pPr>
+              <w:spacing w:line="360" w:lineRule="auto"/>
+            </w:pPr>
             <w:r>
               <w:rPr>
                 <w:b/>
               </w:rPr>
-              <w:t>Level 5:</w:t>
+              <w:t>Upgraded:</w:t>
             </w:r>
           </w:p>
         </w:tc>
@@ -1142,6 +1257,9 @@
             <w:tcW w:w="8090" w:type="dxa"/>
           </w:tcPr>
           <w:p>
+            <w:pPr>
+              <w:spacing w:line="360" w:lineRule="auto"/>
+            </w:pPr>
             <w:r>
               <w:rPr>
                 <w:b/>
@@ -1250,7 +1368,6 @@
         <w:rPr>
           <w:b/>
         </w:rPr>
-        <w:lastRenderedPageBreak/>
         <w:t>Set 2. Topic: Food Waste on Campus</w:t>
       </w:r>
     </w:p>
@@ -1684,12 +1801,10 @@
               <w:t>HKDSE Adapted Paper 2 Prompt:</w:t>
             </w:r>
           </w:p>
+          <w:p/>
           <w:p>
             <w:r>
-              <w:rPr>
-                <w:b w:val="0"/>
-              </w:rPr>
-              <w:t>You are a Form 6 student. A recent survey has found that young people in Hong Kong take far less exercise than they should, and the government is now inviting ideas on how to improve their physical well-being. Write a letter to the editor of the Hong Kong Young Post, suggesting ONE way in which our city can improve the physical well-being of its young people.</w:t>
+              <w:t>A recent survey has found that young people in Hong Kong take far less exercise than they should, and the government is now inviting ideas on how to improve their physical well-being. Write a letter to the editor of the Hong Kong Young Post, suggesting ONE way in which our city can improve the physical well-being of its young people.</w:t>
             </w:r>
           </w:p>
         </w:tc>
@@ -1709,60 +1824,32 @@
     <w:p>
       <w:pPr>
         <w:spacing w:after="0"/>
-        <w:ind w:left="227"/>
       </w:pPr>
       <w:r>
-        <w:rPr>
-          <w:b w:val="0"/>
-        </w:rPr>
-        <w:t>Write ONE body paragraph (about 100 words) for this letter — not the whole letter.</w:t>
+        <w:t>Make ONE suggestion (100 words)</w:t>
+      </w:r>
+      <w:r>
+        <w:t xml:space="preserve"> about improving physical </w:t>
+      </w:r>
+      <w:proofErr w:type="gramStart"/>
+      <w:r>
+        <w:t>well-being, and</w:t>
+      </w:r>
+      <w:proofErr w:type="gramEnd"/>
+      <w:r>
+        <w:t xml:space="preserve"> open your paragraph with ONE of today’s three patterns as the topic sentence.</w:t>
       </w:r>
     </w:p>
     <w:p>
       <w:pPr>
         <w:spacing w:after="0"/>
-        <w:ind w:left="227"/>
       </w:pPr>
-      <w:r>
-        <w:rPr>
-          <w:b w:val="0"/>
-        </w:rPr>
-        <w:t>Make ONE suggestion about improving physical well-being, and open your paragraph with ONE of today’s three patterns as the topic sentence.</w:t>
-      </w:r>
     </w:p>
     <w:p>
       <w:pPr>
         <w:spacing w:after="0"/>
-        <w:ind w:left="227"/>
       </w:pPr>
       <w:r>
-        <w:rPr>
-          <w:b w:val="0"/>
-        </w:rPr>
-        <w:t>Then explain why the suggestion helps, give an example or some evidence, and round the paragraph off.</w:t>
-      </w:r>
-    </w:p>
-    <w:p>
-      <w:pPr>
-        <w:spacing w:after="0"/>
-        <w:ind w:left="227"/>
-      </w:pPr>
-      <w:r>
-        <w:rPr>
-          <w:b w:val="0"/>
-        </w:rPr>
-        <w:t>You do NOT need to use the Lesson 1 or Lesson 2 patterns in the explanation, the example or the round-off.</w:t>
-      </w:r>
-    </w:p>
-    <w:p>
-      <w:pPr>
-        <w:spacing w:after="0"/>
-        <w:ind w:left="227"/>
-      </w:pPr>
-      <w:r>
-        <w:rPr>
-          <w:b w:val="0"/>
-        </w:rPr>
         <w:t>Follow the chain: [Topic sentence] → [Explain] → [Example / evidence] → [Round off].</w:t>
       </w:r>
     </w:p>
@@ -1897,12 +1984,11 @@
         <w:t>________________________________________________________________________________</w:t>
       </w:r>
     </w:p>
-    <w:sectPr>
-      <w:pgSz w:w="11906" w:h="16838"/>
-      <w:pgMar w:top="1134" w:right="1134" w:bottom="1134" w:left="1134" w:header="720" w:footer="720" w:gutter="0"/>
-      <w:cols w:space="720"/>
-      <w:docGrid w:linePitch="360"/>
-    </w:sectPr>
+    <w:p>
+      <w:pPr>
+        <w:spacing w:after="0"/>
+      </w:pPr>
+    </w:p>
   </w:body>
 </w:document>
 </file>

</xml_diff>

<commit_message>
Final: teacher's version finalised from Helen's revised students' copy
</commit_message>
<xml_diff>
--- a/6B Grammar Lesson 3 - Discussing Solutions (Students).docx
+++ b/6B Grammar Lesson 3 - Discussing Solutions (Students).docx
@@ -16,13 +16,13 @@
           <w:lang w:eastAsia="zh-TW"/>
         </w:rPr>
         <w:drawing>
-          <wp:anchor distT="0" distB="0" distL="114300" distR="114300" simplePos="0" relativeHeight="251658240" behindDoc="0" locked="0" layoutInCell="1" allowOverlap="1" wp14:anchorId="40B87859" wp14:editId="7FEDB476">
+          <wp:anchor distT="0" distB="0" distL="114300" distR="114300" simplePos="0" relativeHeight="251658240" behindDoc="0" locked="0" layoutInCell="1" allowOverlap="1" wp14:anchorId="788898DB" wp14:editId="521C2419">
             <wp:simplePos x="0" y="0"/>
             <wp:positionH relativeFrom="column">
-              <wp:posOffset>4275438</wp:posOffset>
+              <wp:posOffset>4707306</wp:posOffset>
             </wp:positionH>
             <wp:positionV relativeFrom="paragraph">
-              <wp:posOffset>-190123</wp:posOffset>
+              <wp:posOffset>-189865</wp:posOffset>
             </wp:positionV>
             <wp:extent cx="1838325" cy="571500"/>
             <wp:effectExtent l="0" t="0" r="9525" b="0"/>
@@ -41,7 +41,7 @@
                     </pic:cNvPicPr>
                   </pic:nvPicPr>
                   <pic:blipFill>
-                    <a:blip r:embed="rId6">
+                    <a:blip r:embed="rId8">
                       <a:extLst>
                         <a:ext uri="{28A0092B-C50C-407E-A947-70E740481C1C}">
                           <a14:useLocalDpi xmlns:a14="http://schemas.microsoft.com/office/drawing/2010/main" val="0"/>
@@ -151,7 +151,7 @@
           </w:tcPr>
           <w:p>
             <w:pPr>
-              <w:spacing w:before="240"/>
+              <w:spacing w:before="240" w:line="480" w:lineRule="auto"/>
             </w:pPr>
             <w:r>
               <w:rPr>
@@ -165,7 +165,7 @@
           </w:p>
           <w:p>
             <w:pPr>
-              <w:spacing w:before="240"/>
+              <w:spacing w:before="240" w:line="480" w:lineRule="auto"/>
             </w:pPr>
             <w:r>
               <w:rPr>
@@ -179,7 +179,7 @@
           </w:p>
           <w:p>
             <w:pPr>
-              <w:spacing w:before="240"/>
+              <w:spacing w:before="240" w:line="480" w:lineRule="auto"/>
             </w:pPr>
             <w:r>
               <w:rPr>
@@ -193,7 +193,7 @@
           </w:p>
           <w:p>
             <w:pPr>
-              <w:spacing w:before="240"/>
+              <w:spacing w:before="240" w:line="480" w:lineRule="auto"/>
             </w:pPr>
             <w:r>
               <w:rPr>
@@ -207,7 +207,7 @@
           </w:p>
           <w:p>
             <w:pPr>
-              <w:spacing w:before="240"/>
+              <w:spacing w:before="240" w:line="480" w:lineRule="auto"/>
             </w:pPr>
             <w:r>
               <w:rPr>
@@ -221,7 +221,7 @@
           </w:p>
           <w:p>
             <w:pPr>
-              <w:spacing w:before="240"/>
+              <w:spacing w:before="240" w:line="480" w:lineRule="auto"/>
             </w:pPr>
             <w:r>
               <w:rPr>
@@ -244,193 +244,9 @@
     <w:p>
       <w:pPr>
         <w:spacing w:before="160" w:after="120"/>
-      </w:pPr>
-      <w:r>
         <w:rPr>
           <w:b/>
         </w:rPr>
-        <w:t>Write the corrected sentences below:</w:t>
-      </w:r>
-    </w:p>
-    <w:tbl>
-      <w:tblPr>
-        <w:tblStyle w:val="TableGrid"/>
-        <w:tblW w:type="auto" w:w="0"/>
-        <w:jc w:val="left"/>
-        <w:tblLayout w:type="fixed"/>
-        <w:tblLook w:firstColumn="1" w:firstRow="1" w:lastColumn="0" w:lastRow="0" w:noHBand="0" w:noVBand="1" w:val="04A0"/>
-        <w:tblLayout w:type="fixed"/>
-      </w:tblPr>
-      <w:tblGrid>
-        <w:gridCol w:w="4819"/>
-        <w:gridCol w:w="4819"/>
-      </w:tblGrid>
-      <w:tr>
-        <w:tc>
-          <w:tcPr>
-            <w:tcW w:type="dxa" w:w="567"/>
-            <w:shd w:val="clear" w:color="auto" w:fill="D9D9D9"/>
-          </w:tcPr>
-          <w:p>
-            <w:r>
-              <w:rPr>
-                <w:b/>
-              </w:rPr>
-              <w:t>Item</w:t>
-            </w:r>
-          </w:p>
-        </w:tc>
-        <w:tc>
-          <w:tcPr>
-            <w:tcW w:type="dxa" w:w="9071"/>
-            <w:shd w:val="clear" w:color="auto" w:fill="D9D9D9"/>
-          </w:tcPr>
-          <w:p>
-            <w:r>
-              <w:rPr>
-                <w:b/>
-              </w:rPr>
-              <w:t>Corrected sentence</w:t>
-            </w:r>
-          </w:p>
-        </w:tc>
-      </w:tr>
-      <w:tr>
-        <w:tc>
-          <w:tcPr>
-            <w:tcW w:type="dxa" w:w="567"/>
-          </w:tcPr>
-          <w:p>
-            <w:r>
-              <w:rPr>
-                <w:b/>
-              </w:rPr>
-              <w:t>1.</w:t>
-            </w:r>
-          </w:p>
-        </w:tc>
-        <w:tc>
-          <w:tcPr>
-            <w:tcW w:type="dxa" w:w="9071"/>
-          </w:tcPr>
-          <w:p/>
-          <w:p/>
-        </w:tc>
-      </w:tr>
-      <w:tr>
-        <w:tc>
-          <w:tcPr>
-            <w:tcW w:type="dxa" w:w="567"/>
-          </w:tcPr>
-          <w:p>
-            <w:r>
-              <w:rPr>
-                <w:b/>
-              </w:rPr>
-              <w:t>2.</w:t>
-            </w:r>
-          </w:p>
-        </w:tc>
-        <w:tc>
-          <w:tcPr>
-            <w:tcW w:type="dxa" w:w="9071"/>
-          </w:tcPr>
-          <w:p/>
-          <w:p/>
-        </w:tc>
-      </w:tr>
-      <w:tr>
-        <w:tc>
-          <w:tcPr>
-            <w:tcW w:type="dxa" w:w="567"/>
-          </w:tcPr>
-          <w:p>
-            <w:r>
-              <w:rPr>
-                <w:b/>
-              </w:rPr>
-              <w:t>3.</w:t>
-            </w:r>
-          </w:p>
-        </w:tc>
-        <w:tc>
-          <w:tcPr>
-            <w:tcW w:type="dxa" w:w="9071"/>
-          </w:tcPr>
-          <w:p/>
-          <w:p/>
-        </w:tc>
-      </w:tr>
-      <w:tr>
-        <w:tc>
-          <w:tcPr>
-            <w:tcW w:type="dxa" w:w="567"/>
-          </w:tcPr>
-          <w:p>
-            <w:r>
-              <w:rPr>
-                <w:b/>
-              </w:rPr>
-              <w:t>4.</w:t>
-            </w:r>
-          </w:p>
-        </w:tc>
-        <w:tc>
-          <w:tcPr>
-            <w:tcW w:type="dxa" w:w="9071"/>
-          </w:tcPr>
-          <w:p/>
-          <w:p/>
-        </w:tc>
-      </w:tr>
-      <w:tr>
-        <w:tc>
-          <w:tcPr>
-            <w:tcW w:type="dxa" w:w="567"/>
-          </w:tcPr>
-          <w:p>
-            <w:r>
-              <w:rPr>
-                <w:b/>
-              </w:rPr>
-              <w:t>5.</w:t>
-            </w:r>
-          </w:p>
-        </w:tc>
-        <w:tc>
-          <w:tcPr>
-            <w:tcW w:type="dxa" w:w="9071"/>
-          </w:tcPr>
-          <w:p/>
-          <w:p/>
-        </w:tc>
-      </w:tr>
-      <w:tr>
-        <w:tc>
-          <w:tcPr>
-            <w:tcW w:type="dxa" w:w="567"/>
-          </w:tcPr>
-          <w:p>
-            <w:r>
-              <w:rPr>
-                <w:b/>
-              </w:rPr>
-              <w:t>6.</w:t>
-            </w:r>
-          </w:p>
-        </w:tc>
-        <w:tc>
-          <w:tcPr>
-            <w:tcW w:type="dxa" w:w="9071"/>
-          </w:tcPr>
-          <w:p/>
-          <w:p/>
-        </w:tc>
-      </w:tr>
-    </w:tbl>
-    <w:p>
-      <w:pPr>
-        <w:spacing w:after="0"/>
       </w:pPr>
     </w:p>
     <w:p>
@@ -746,19 +562,7 @@
               <w:rPr>
                 <w:i/>
               </w:rPr>
-              <w:t xml:space="preserve"> rarely pick </w:t>
-            </w:r>
-            <w:r>
-              <w:rPr>
-                <w:i/>
-              </w:rPr>
-              <w:t xml:space="preserve">that </w:t>
-            </w:r>
-            <w:r>
-              <w:rPr>
-                <w:i/>
-              </w:rPr>
-              <w:t>up again.</w:t>
+              <w:t xml:space="preserve"> rarely pick that up again.</w:t>
             </w:r>
           </w:p>
           <w:p/>
@@ -830,74 +634,85 @@
     </w:tbl>
     <w:p>
       <w:pPr>
-        <w:spacing w:after="0"/>
-      </w:pPr>
-    </w:p>
-    <w:p>
-      <w:pPr>
         <w:spacing w:before="160" w:after="120"/>
       </w:pPr>
       <w:r>
         <w:rPr>
           <w:b/>
         </w:rPr>
+        <w:lastRenderedPageBreak/>
         <w:t>PART C: UPGRADING SENTENCE</w:t>
       </w:r>
     </w:p>
-    <w:tbl>
-      <w:tblPr>
-        <w:tblStyle w:val="TableGrid"/>
-        <w:tblW w:w="0" w:type="auto"/>
-        <w:tblLayout w:type="fixed"/>
-        <w:tblLook w:val="04A0" w:firstRow="1" w:lastRow="0" w:firstColumn="1" w:lastColumn="0" w:noHBand="0" w:noVBand="1"/>
-      </w:tblPr>
-      <w:tblGrid>
-        <w:gridCol w:w="9638"/>
-      </w:tblGrid>
-      <w:tr>
-        <w:tc>
-          <w:tcPr>
-            <w:tcW w:w="9638" w:type="dxa"/>
-            <w:shd w:val="clear" w:color="auto" w:fill="D9D9D9"/>
-          </w:tcPr>
-          <w:p>
-            <w:pPr>
-              <w:spacing w:line="360" w:lineRule="auto"/>
-            </w:pPr>
-            <w:r>
-              <w:rPr>
-                <w:b/>
-              </w:rPr>
-              <w:t>THE BASIC SENTENCES STUDENTS USUALLY WRITE</w:t>
-            </w:r>
-          </w:p>
-          <w:p>
-            <w:pPr>
-              <w:spacing w:line="360" w:lineRule="auto"/>
-            </w:pPr>
-            <w:r>
-              <w:t>The government can build more sports facilities.</w:t>
-            </w:r>
-          </w:p>
-          <w:p>
-            <w:pPr>
-              <w:spacing w:line="360" w:lineRule="auto"/>
-            </w:pPr>
-            <w:r>
-              <w:t>Schools can organise more sports activities and sports days.</w:t>
-            </w:r>
-          </w:p>
-          <w:p>
-            <w:pPr>
-              <w:spacing w:line="360" w:lineRule="auto"/>
-            </w:pPr>
-            <w:r>
-              <w:t>Parents can exercise with their children at weekends.</w:t>
-            </w:r>
-          </w:p>
-        </w:tc>
-      </w:tr>
-    </w:tbl>
+    <w:p>
+      <w:pPr>
+        <w:spacing w:after="0"/>
+        <w:jc w:val="center"/>
+      </w:pPr>
+      <w:r>
+        <w:rPr>
+          <w:rFonts w:ascii="Segoe UI Symbol" w:hAnsi="Segoe UI Symbol" w:cs="Segoe UI Symbol"/>
+          <w:color w:val="333333"/>
+          <w:sz w:val="27"/>
+          <w:szCs w:val="27"/>
+          <w:shd w:val="clear" w:color="auto" w:fill="FFFFFF"/>
+        </w:rPr>
+        <w:t>✗</w:t>
+      </w:r>
+      <w:r>
+        <w:t xml:space="preserve"> </w:t>
+      </w:r>
+      <w:r>
+        <w:t>The government can</w:t>
+      </w:r>
+      <w:r>
+        <w:t xml:space="preserve"> …</w:t>
+      </w:r>
+      <w:r>
+        <w:tab/>
+      </w:r>
+      <w:r>
+        <w:rPr>
+          <w:rFonts w:ascii="Segoe UI Symbol" w:hAnsi="Segoe UI Symbol" w:cs="Segoe UI Symbol"/>
+          <w:color w:val="333333"/>
+          <w:sz w:val="27"/>
+          <w:szCs w:val="27"/>
+          <w:shd w:val="clear" w:color="auto" w:fill="FFFFFF"/>
+        </w:rPr>
+        <w:t>✗</w:t>
+      </w:r>
+      <w:r>
+        <w:t xml:space="preserve"> </w:t>
+      </w:r>
+      <w:r>
+        <w:t xml:space="preserve">Schools </w:t>
+      </w:r>
+      <w:r>
+        <w:t>can …</w:t>
+      </w:r>
+      <w:r>
+        <w:tab/>
+      </w:r>
+      <w:r>
+        <w:rPr>
+          <w:rFonts w:ascii="Segoe UI Symbol" w:hAnsi="Segoe UI Symbol" w:cs="Segoe UI Symbol"/>
+          <w:color w:val="333333"/>
+          <w:sz w:val="27"/>
+          <w:szCs w:val="27"/>
+          <w:shd w:val="clear" w:color="auto" w:fill="FFFFFF"/>
+        </w:rPr>
+        <w:t>✗</w:t>
+      </w:r>
+      <w:r>
+        <w:t xml:space="preserve"> </w:t>
+      </w:r>
+      <w:r>
+        <w:t>Parents</w:t>
+      </w:r>
+      <w:r>
+        <w:t xml:space="preserve"> can …</w:t>
+      </w:r>
+    </w:p>
     <w:p>
       <w:pPr>
         <w:spacing w:after="0"/>
@@ -906,7 +721,7 @@
     <w:tbl>
       <w:tblPr>
         <w:tblStyle w:val="TableGrid"/>
-        <w:tblW w:w="0" w:type="auto"/>
+        <w:tblW w:w="9638" w:type="dxa"/>
         <w:tblLayout w:type="fixed"/>
         <w:tblLook w:val="04A0" w:firstRow="1" w:lastRow="0" w:firstColumn="1" w:lastColumn="0" w:noHBand="0" w:noVBand="1"/>
       </w:tblPr>
@@ -919,6 +734,7 @@
           <w:tcPr>
             <w:tcW w:w="9638" w:type="dxa"/>
             <w:gridSpan w:val="2"/>
+            <w:shd w:val="clear" w:color="auto" w:fill="D9D9D9" w:themeFill="background1" w:themeFillShade="D9"/>
           </w:tcPr>
           <w:p>
             <w:pPr>
@@ -928,18 +744,10 @@
               <w:rPr>
                 <w:b/>
               </w:rPr>
-              <w:t>Pattern 1 — Calling for Immediate Action</w:t>
+              <w:t xml:space="preserve">Pattern 1 </w:t>
             </w:r>
-          </w:p>
-          <w:p>
-            <w:pPr>
-              <w:spacing w:line="360" w:lineRule="auto"/>
-            </w:pPr>
             <w:r>
-              <w:rPr>
-                <w:b/>
-              </w:rPr>
-              <w:t xml:space="preserve">Target Formula: </w:t>
+              <w:t xml:space="preserve">           </w:t>
             </w:r>
             <w:r>
               <w:t>There is an urgent need for [doer] to [base verb phrase].</w:t>
@@ -960,13 +768,7 @@
               <w:rPr>
                 <w:b/>
               </w:rPr>
-              <w:t>Basic</w:t>
-            </w:r>
-            <w:r>
-              <w:rPr>
-                <w:b/>
-              </w:rPr>
-              <w:t>:</w:t>
+              <w:t>Basic:</w:t>
             </w:r>
           </w:p>
         </w:tc>
@@ -997,13 +799,7 @@
               <w:rPr>
                 <w:b/>
               </w:rPr>
-              <w:t>Upgraded</w:t>
-            </w:r>
-            <w:r>
-              <w:rPr>
-                <w:b/>
-              </w:rPr>
-              <w:t>:</w:t>
+              <w:t>Upgraded:</w:t>
             </w:r>
           </w:p>
         </w:tc>
@@ -1037,6 +833,14 @@
         </w:tc>
       </w:tr>
     </w:tbl>
+    <w:p>
+      <w:pPr>
+        <w:spacing w:before="160" w:after="120" w:line="240" w:lineRule="auto"/>
+        <w:rPr>
+          <w:b/>
+        </w:rPr>
+      </w:pPr>
+    </w:p>
     <w:tbl>
       <w:tblPr>
         <w:tblStyle w:val="TableGrid"/>
@@ -1053,6 +857,7 @@
           <w:tcPr>
             <w:tcW w:w="9638" w:type="dxa"/>
             <w:gridSpan w:val="2"/>
+            <w:shd w:val="clear" w:color="auto" w:fill="D9D9D9" w:themeFill="background1" w:themeFillShade="D9"/>
           </w:tcPr>
           <w:p>
             <w:pPr>
@@ -1062,19 +867,10 @@
               <w:rPr>
                 <w:b/>
               </w:rPr>
-              <w:lastRenderedPageBreak/>
-              <w:t>Pattern 2 — Purpose-First Recommendation</w:t>
+              <w:t xml:space="preserve">Pattern 2 </w:t>
             </w:r>
-          </w:p>
-          <w:p>
-            <w:pPr>
-              <w:spacing w:line="360" w:lineRule="auto"/>
-            </w:pPr>
             <w:r>
-              <w:rPr>
-                <w:b/>
-              </w:rPr>
-              <w:t xml:space="preserve">Target Formula: </w:t>
+              <w:t xml:space="preserve">           </w:t>
             </w:r>
             <w:r>
               <w:t>To [goal], [doer] should make it a priority to [base verb phrase].</w:t>
@@ -1108,7 +904,15 @@
               <w:spacing w:line="360" w:lineRule="auto"/>
             </w:pPr>
             <w:r>
-              <w:t>Schools can organise more sports activities and sports days.</w:t>
+              <w:t xml:space="preserve">Schools can </w:t>
+            </w:r>
+            <w:proofErr w:type="spellStart"/>
+            <w:r>
+              <w:t>organise</w:t>
+            </w:r>
+            <w:proofErr w:type="spellEnd"/>
+            <w:r>
+              <w:t xml:space="preserve"> more sports activities and sports days.</w:t>
             </w:r>
           </w:p>
         </w:tc>
@@ -1160,10 +964,18 @@
         </w:tc>
       </w:tr>
     </w:tbl>
+    <w:p>
+      <w:pPr>
+        <w:spacing w:before="160" w:after="120" w:line="240" w:lineRule="auto"/>
+        <w:rPr>
+          <w:b/>
+        </w:rPr>
+      </w:pPr>
+    </w:p>
     <w:tbl>
       <w:tblPr>
         <w:tblStyle w:val="TableGrid"/>
-        <w:tblW w:w="9638" w:type="dxa"/>
+        <w:tblW w:w="0" w:type="auto"/>
         <w:tblLayout w:type="fixed"/>
         <w:tblLook w:val="04A0" w:firstRow="1" w:lastRow="0" w:firstColumn="1" w:lastColumn="0" w:noHBand="0" w:noVBand="1"/>
       </w:tblPr>
@@ -1176,30 +988,40 @@
           <w:tcPr>
             <w:tcW w:w="9638" w:type="dxa"/>
             <w:gridSpan w:val="2"/>
+            <w:shd w:val="clear" w:color="auto" w:fill="D9D9D9" w:themeFill="background1" w:themeFillShade="D9"/>
           </w:tcPr>
           <w:p>
             <w:pPr>
               <w:spacing w:line="360" w:lineRule="auto"/>
+              <w:rPr>
+                <w:b/>
+              </w:rPr>
             </w:pPr>
             <w:r>
               <w:rPr>
                 <w:b/>
               </w:rPr>
-              <w:t>Pattern 3 — Shared Responsibility</w:t>
+              <w:t>Pattern 3</w:t>
             </w:r>
-          </w:p>
-          <w:p>
-            <w:pPr>
-              <w:spacing w:line="360" w:lineRule="auto"/>
-            </w:pPr>
             <w:r>
               <w:rPr>
                 <w:b/>
               </w:rPr>
-              <w:t xml:space="preserve">Target Formula: </w:t>
+              <w:t xml:space="preserve">         </w:t>
+            </w:r>
+            <w:proofErr w:type="gramStart"/>
+            <w:r>
+              <w:rPr>
+                <w:b/>
+              </w:rPr>
+              <w:t xml:space="preserve">   </w:t>
             </w:r>
             <w:r>
-              <w:t>[Doer], in collaboration with [second party], should [verb phrase].</w:t>
+              <w:t>[</w:t>
+            </w:r>
+            <w:proofErr w:type="gramEnd"/>
+            <w:r>
+              <w:t>Doer], in collaboration with [second party], should [verb phrase].</w:t>
             </w:r>
           </w:p>
         </w:tc>
@@ -1275,6 +1097,14 @@
     </w:tbl>
     <w:p>
       <w:pPr>
+        <w:spacing w:before="160" w:after="120" w:line="360" w:lineRule="auto"/>
+        <w:rPr>
+          <w:b/>
+        </w:rPr>
+      </w:pPr>
+    </w:p>
+    <w:p>
+      <w:pPr>
         <w:spacing w:before="160" w:after="120"/>
       </w:pPr>
       <w:r>
@@ -1282,11 +1112,6 @@
           <w:b/>
         </w:rPr>
         <w:t>PART D: PRACTICE SETS</w:t>
-      </w:r>
-    </w:p>
-    <w:p>
-      <w:r>
-        <w:t>Upgrade each simple sentence with the pattern shown, and keep the pattern to ONE clause, as taught in Part C. The topics are different from the fitness topic in Part C. Sets 4–6 are more challenging: you must join the TWO simple sentences into ONE upgraded sentence.</w:t>
       </w:r>
     </w:p>
     <w:p>
@@ -1321,7 +1146,7 @@
               <w:rPr>
                 <w:b/>
               </w:rPr>
-              <w:t>Simple sentence</w:t>
+              <w:t>Basic</w:t>
             </w:r>
           </w:p>
         </w:tc>
@@ -1334,6 +1159,7 @@
               <w:t>The government can tell teenagers about the importance of sleep.</w:t>
             </w:r>
           </w:p>
+          <w:p/>
         </w:tc>
       </w:tr>
       <w:tr>
@@ -1368,6 +1194,12 @@
         <w:rPr>
           <w:b/>
         </w:rPr>
+        <w:br/>
+      </w:r>
+      <w:r>
+        <w:rPr>
+          <w:b/>
+        </w:rPr>
         <w:t>Set 2. Topic: Food Waste on Campus</w:t>
       </w:r>
     </w:p>
@@ -1392,7 +1224,7 @@
               <w:rPr>
                 <w:b/>
               </w:rPr>
-              <w:t>Simple sentence</w:t>
+              <w:t>Basic</w:t>
             </w:r>
           </w:p>
         </w:tc>
@@ -1403,6 +1235,262 @@
           <w:p>
             <w:r>
               <w:t>Schools can ask students not to waste food in the canteen.</w:t>
+            </w:r>
+          </w:p>
+          <w:p/>
+        </w:tc>
+      </w:tr>
+      <w:tr>
+        <w:tc>
+          <w:tcPr>
+            <w:tcW w:w="1548" w:type="dxa"/>
+          </w:tcPr>
+          <w:p>
+            <w:r>
+              <w:rPr>
+                <w:b/>
+              </w:rPr>
+              <w:t>Use Pattern 2</w:t>
+            </w:r>
+          </w:p>
+        </w:tc>
+        <w:tc>
+          <w:tcPr>
+            <w:tcW w:w="8090" w:type="dxa"/>
+          </w:tcPr>
+          <w:p/>
+          <w:p/>
+          <w:p/>
+        </w:tc>
+      </w:tr>
+    </w:tbl>
+    <w:p>
+      <w:pPr>
+        <w:spacing w:before="120" w:after="80"/>
+      </w:pPr>
+      <w:r>
+        <w:rPr>
+          <w:b/>
+        </w:rPr>
+        <w:br/>
+      </w:r>
+      <w:r>
+        <w:rPr>
+          <w:b/>
+        </w:rPr>
+        <w:t>Set 3. Topic: Cyberbullying</w:t>
+      </w:r>
+    </w:p>
+    <w:tbl>
+      <w:tblPr>
+        <w:tblStyle w:val="TableGrid"/>
+        <w:tblW w:w="0" w:type="auto"/>
+        <w:tblLayout w:type="fixed"/>
+        <w:tblLook w:val="04A0" w:firstRow="1" w:lastRow="0" w:firstColumn="1" w:lastColumn="0" w:noHBand="0" w:noVBand="1"/>
+      </w:tblPr>
+      <w:tblGrid>
+        <w:gridCol w:w="1548"/>
+        <w:gridCol w:w="8090"/>
+      </w:tblGrid>
+      <w:tr>
+        <w:tc>
+          <w:tcPr>
+            <w:tcW w:w="1548" w:type="dxa"/>
+          </w:tcPr>
+          <w:p>
+            <w:r>
+              <w:rPr>
+                <w:b/>
+              </w:rPr>
+              <w:t>Basic</w:t>
+            </w:r>
+          </w:p>
+        </w:tc>
+        <w:tc>
+          <w:tcPr>
+            <w:tcW w:w="8090" w:type="dxa"/>
+          </w:tcPr>
+          <w:p>
+            <w:r>
+              <w:t>Parents can talk to their children about cyberbullying.</w:t>
+            </w:r>
+          </w:p>
+          <w:p/>
+        </w:tc>
+      </w:tr>
+      <w:tr>
+        <w:tc>
+          <w:tcPr>
+            <w:tcW w:w="1548" w:type="dxa"/>
+          </w:tcPr>
+          <w:p>
+            <w:r>
+              <w:rPr>
+                <w:b/>
+              </w:rPr>
+              <w:t>Use Pattern 3</w:t>
+            </w:r>
+          </w:p>
+        </w:tc>
+        <w:tc>
+          <w:tcPr>
+            <w:tcW w:w="8090" w:type="dxa"/>
+          </w:tcPr>
+          <w:p/>
+          <w:p/>
+          <w:p/>
+        </w:tc>
+      </w:tr>
+    </w:tbl>
+    <w:p>
+      <w:pPr>
+        <w:rPr>
+          <w:b/>
+        </w:rPr>
+      </w:pPr>
+    </w:p>
+    <w:p>
+      <w:pPr>
+        <w:rPr>
+          <w:b/>
+        </w:rPr>
+      </w:pPr>
+      <w:r>
+        <w:rPr>
+          <w:b/>
+        </w:rPr>
+        <w:lastRenderedPageBreak/>
+        <w:t>Set 4. Topic: Youth Mental Health (more challenging)</w:t>
+      </w:r>
+    </w:p>
+    <w:tbl>
+      <w:tblPr>
+        <w:tblStyle w:val="TableGrid"/>
+        <w:tblW w:w="0" w:type="auto"/>
+        <w:tblLayout w:type="fixed"/>
+        <w:tblLook w:val="04A0" w:firstRow="1" w:lastRow="0" w:firstColumn="1" w:lastColumn="0" w:noHBand="0" w:noVBand="1"/>
+      </w:tblPr>
+      <w:tblGrid>
+        <w:gridCol w:w="1548"/>
+        <w:gridCol w:w="8090"/>
+      </w:tblGrid>
+      <w:tr>
+        <w:tc>
+          <w:tcPr>
+            <w:tcW w:w="1548" w:type="dxa"/>
+          </w:tcPr>
+          <w:p>
+            <w:r>
+              <w:rPr>
+                <w:b/>
+              </w:rPr>
+              <w:t>Basic</w:t>
+            </w:r>
+          </w:p>
+        </w:tc>
+        <w:tc>
+          <w:tcPr>
+            <w:tcW w:w="8090" w:type="dxa"/>
+          </w:tcPr>
+          <w:p>
+            <w:r>
+              <w:t>The government can spend more money on mental health services</w:t>
+            </w:r>
+            <w:r>
+              <w:t xml:space="preserve"> </w:t>
+            </w:r>
+            <w:r>
+              <w:t xml:space="preserve">in schools </w:t>
+            </w:r>
+            <w:r>
+              <w:t>because young people need these services.</w:t>
+            </w:r>
+          </w:p>
+          <w:p/>
+        </w:tc>
+      </w:tr>
+      <w:tr>
+        <w:tc>
+          <w:tcPr>
+            <w:tcW w:w="1548" w:type="dxa"/>
+          </w:tcPr>
+          <w:p>
+            <w:r>
+              <w:rPr>
+                <w:b/>
+              </w:rPr>
+              <w:t>Use Pattern 1</w:t>
+            </w:r>
+          </w:p>
+        </w:tc>
+        <w:tc>
+          <w:tcPr>
+            <w:tcW w:w="8090" w:type="dxa"/>
+          </w:tcPr>
+          <w:p/>
+          <w:p/>
+          <w:p/>
+        </w:tc>
+      </w:tr>
+    </w:tbl>
+    <w:p>
+      <w:pPr>
+        <w:spacing w:before="120" w:after="80"/>
+      </w:pPr>
+      <w:r>
+        <w:rPr>
+          <w:b/>
+        </w:rPr>
+        <w:br/>
+      </w:r>
+      <w:r>
+        <w:rPr>
+          <w:b/>
+        </w:rPr>
+        <w:t>Set 5. Topic: Declining Reading Habits (more challenging)</w:t>
+      </w:r>
+    </w:p>
+    <w:tbl>
+      <w:tblPr>
+        <w:tblStyle w:val="TableGrid"/>
+        <w:tblW w:w="0" w:type="auto"/>
+        <w:tblLayout w:type="fixed"/>
+        <w:tblLook w:val="04A0" w:firstRow="1" w:lastRow="0" w:firstColumn="1" w:lastColumn="0" w:noHBand="0" w:noVBand="1"/>
+      </w:tblPr>
+      <w:tblGrid>
+        <w:gridCol w:w="1548"/>
+        <w:gridCol w:w="8090"/>
+      </w:tblGrid>
+      <w:tr>
+        <w:tc>
+          <w:tcPr>
+            <w:tcW w:w="1548" w:type="dxa"/>
+          </w:tcPr>
+          <w:p>
+            <w:pPr>
+              <w:rPr>
+                <w:b/>
+              </w:rPr>
+            </w:pPr>
+            <w:r>
+              <w:rPr>
+                <w:b/>
+              </w:rPr>
+              <w:t>Basic</w:t>
+            </w:r>
+          </w:p>
+          <w:p/>
+        </w:tc>
+        <w:tc>
+          <w:tcPr>
+            <w:tcW w:w="8090" w:type="dxa"/>
+          </w:tcPr>
+          <w:p>
+            <w:r>
+              <w:t>Schools can keep the library open after school</w:t>
+            </w:r>
+            <w:r>
+              <w:t xml:space="preserve"> as students need a quiet place to read.</w:t>
             </w:r>
           </w:p>
         </w:tc>
@@ -1439,251 +1527,8 @@
         <w:rPr>
           <w:b/>
         </w:rPr>
-        <w:t>Set 3. Topic: Cyberbullying</w:t>
+        <w:br/>
       </w:r>
-    </w:p>
-    <w:tbl>
-      <w:tblPr>
-        <w:tblStyle w:val="TableGrid"/>
-        <w:tblW w:w="0" w:type="auto"/>
-        <w:tblLayout w:type="fixed"/>
-        <w:tblLook w:val="04A0" w:firstRow="1" w:lastRow="0" w:firstColumn="1" w:lastColumn="0" w:noHBand="0" w:noVBand="1"/>
-      </w:tblPr>
-      <w:tblGrid>
-        <w:gridCol w:w="1548"/>
-        <w:gridCol w:w="8090"/>
-      </w:tblGrid>
-      <w:tr>
-        <w:tc>
-          <w:tcPr>
-            <w:tcW w:w="1548" w:type="dxa"/>
-          </w:tcPr>
-          <w:p>
-            <w:r>
-              <w:rPr>
-                <w:b/>
-              </w:rPr>
-              <w:t>Simple sentence</w:t>
-            </w:r>
-          </w:p>
-        </w:tc>
-        <w:tc>
-          <w:tcPr>
-            <w:tcW w:w="8090" w:type="dxa"/>
-          </w:tcPr>
-          <w:p>
-            <w:r>
-              <w:t>Parents can talk to their children about cyberbullying.</w:t>
-            </w:r>
-          </w:p>
-        </w:tc>
-      </w:tr>
-      <w:tr>
-        <w:tc>
-          <w:tcPr>
-            <w:tcW w:w="1548" w:type="dxa"/>
-          </w:tcPr>
-          <w:p>
-            <w:r>
-              <w:rPr>
-                <w:b/>
-              </w:rPr>
-              <w:t>Use Pattern 3</w:t>
-            </w:r>
-          </w:p>
-        </w:tc>
-        <w:tc>
-          <w:tcPr>
-            <w:tcW w:w="8090" w:type="dxa"/>
-          </w:tcPr>
-          <w:p/>
-          <w:p/>
-          <w:p/>
-        </w:tc>
-      </w:tr>
-    </w:tbl>
-    <w:p>
-      <w:pPr>
-        <w:spacing w:before="120" w:after="80"/>
-      </w:pPr>
-      <w:r>
-        <w:rPr>
-          <w:b/>
-        </w:rPr>
-        <w:t>Set 4. Topic: Youth Mental Health (more challenging)</w:t>
-      </w:r>
-    </w:p>
-    <w:tbl>
-      <w:tblPr>
-        <w:tblStyle w:val="TableGrid"/>
-        <w:tblW w:w="0" w:type="auto"/>
-        <w:tblLayout w:type="fixed"/>
-        <w:tblLook w:val="04A0" w:firstRow="1" w:lastRow="0" w:firstColumn="1" w:lastColumn="0" w:noHBand="0" w:noVBand="1"/>
-      </w:tblPr>
-      <w:tblGrid>
-        <w:gridCol w:w="1548"/>
-        <w:gridCol w:w="8090"/>
-      </w:tblGrid>
-      <w:tr>
-        <w:tc>
-          <w:tcPr>
-            <w:tcW w:w="1548" w:type="dxa"/>
-          </w:tcPr>
-          <w:p>
-            <w:r>
-              <w:rPr>
-                <w:b/>
-              </w:rPr>
-              <w:t>Simple sentences</w:t>
-            </w:r>
-          </w:p>
-        </w:tc>
-        <w:tc>
-          <w:tcPr>
-            <w:tcW w:w="8090" w:type="dxa"/>
-          </w:tcPr>
-          <w:p>
-            <w:r>
-              <w:t>The government can spend more money on mental health services.</w:t>
-            </w:r>
-          </w:p>
-        </w:tc>
-      </w:tr>
-      <w:tr>
-        <w:tc>
-          <w:tcPr>
-            <w:tcW w:w="1548" w:type="dxa"/>
-          </w:tcPr>
-          <w:p/>
-        </w:tc>
-        <w:tc>
-          <w:tcPr>
-            <w:tcW w:w="8090" w:type="dxa"/>
-          </w:tcPr>
-          <w:p>
-            <w:r>
-              <w:t>Young people need these services at school.</w:t>
-            </w:r>
-          </w:p>
-        </w:tc>
-      </w:tr>
-      <w:tr>
-        <w:tc>
-          <w:tcPr>
-            <w:tcW w:w="1548" w:type="dxa"/>
-          </w:tcPr>
-          <w:p>
-            <w:r>
-              <w:rPr>
-                <w:b/>
-              </w:rPr>
-              <w:t>Use Pattern 1</w:t>
-            </w:r>
-          </w:p>
-        </w:tc>
-        <w:tc>
-          <w:tcPr>
-            <w:tcW w:w="8090" w:type="dxa"/>
-          </w:tcPr>
-          <w:p/>
-          <w:p/>
-          <w:p/>
-        </w:tc>
-      </w:tr>
-    </w:tbl>
-    <w:p>
-      <w:pPr>
-        <w:spacing w:before="120" w:after="80"/>
-      </w:pPr>
-      <w:r>
-        <w:rPr>
-          <w:b/>
-        </w:rPr>
-        <w:t>Set 5. Topic: Declining Reading Habits (more challenging)</w:t>
-      </w:r>
-    </w:p>
-    <w:tbl>
-      <w:tblPr>
-        <w:tblStyle w:val="TableGrid"/>
-        <w:tblW w:w="0" w:type="auto"/>
-        <w:tblLayout w:type="fixed"/>
-        <w:tblLook w:val="04A0" w:firstRow="1" w:lastRow="0" w:firstColumn="1" w:lastColumn="0" w:noHBand="0" w:noVBand="1"/>
-      </w:tblPr>
-      <w:tblGrid>
-        <w:gridCol w:w="1548"/>
-        <w:gridCol w:w="8090"/>
-      </w:tblGrid>
-      <w:tr>
-        <w:tc>
-          <w:tcPr>
-            <w:tcW w:w="1548" w:type="dxa"/>
-          </w:tcPr>
-          <w:p>
-            <w:r>
-              <w:rPr>
-                <w:b/>
-              </w:rPr>
-              <w:t>Simple sentences</w:t>
-            </w:r>
-          </w:p>
-        </w:tc>
-        <w:tc>
-          <w:tcPr>
-            <w:tcW w:w="8090" w:type="dxa"/>
-          </w:tcPr>
-          <w:p>
-            <w:r>
-              <w:t>Schools can keep the library open after school.</w:t>
-            </w:r>
-          </w:p>
-        </w:tc>
-      </w:tr>
-      <w:tr>
-        <w:tc>
-          <w:tcPr>
-            <w:tcW w:w="1548" w:type="dxa"/>
-          </w:tcPr>
-          <w:p/>
-        </w:tc>
-        <w:tc>
-          <w:tcPr>
-            <w:tcW w:w="8090" w:type="dxa"/>
-          </w:tcPr>
-          <w:p>
-            <w:r>
-              <w:t>Students need a quiet place to read.</w:t>
-            </w:r>
-          </w:p>
-        </w:tc>
-      </w:tr>
-      <w:tr>
-        <w:tc>
-          <w:tcPr>
-            <w:tcW w:w="1548" w:type="dxa"/>
-          </w:tcPr>
-          <w:p>
-            <w:r>
-              <w:rPr>
-                <w:b/>
-              </w:rPr>
-              <w:t>Use Pattern 2</w:t>
-            </w:r>
-          </w:p>
-        </w:tc>
-        <w:tc>
-          <w:tcPr>
-            <w:tcW w:w="8090" w:type="dxa"/>
-          </w:tcPr>
-          <w:p/>
-          <w:p/>
-          <w:p/>
-        </w:tc>
-      </w:tr>
-    </w:tbl>
-    <w:p>
-      <w:pPr>
-        <w:spacing w:before="120" w:after="80"/>
-      </w:pPr>
       <w:r>
         <w:rPr>
           <w:b/>
@@ -1722,27 +1567,32 @@
           </w:tcPr>
           <w:p>
             <w:r>
-              <w:t>Teenagers can visit elderly neighbours who live alone.</w:t>
+              <w:t xml:space="preserve">Teenagers can visit </w:t>
+            </w:r>
+            <w:r>
+              <w:t>old people</w:t>
+            </w:r>
+            <w:r>
+              <w:t xml:space="preserve"> who live </w:t>
+            </w:r>
+            <w:proofErr w:type="gramStart"/>
+            <w:r>
+              <w:t>alone</w:t>
+            </w:r>
+            <w:proofErr w:type="gramEnd"/>
+            <w:r>
+              <w:t xml:space="preserve"> and community </w:t>
+            </w:r>
+            <w:proofErr w:type="spellStart"/>
+            <w:r>
+              <w:t>centres</w:t>
+            </w:r>
+            <w:proofErr w:type="spellEnd"/>
+            <w:r>
+              <w:t xml:space="preserve"> can arrange these visits.</w:t>
             </w:r>
           </w:p>
-        </w:tc>
-      </w:tr>
-      <w:tr>
-        <w:tc>
-          <w:tcPr>
-            <w:tcW w:w="1548" w:type="dxa"/>
-          </w:tcPr>
           <w:p/>
-        </w:tc>
-        <w:tc>
-          <w:tcPr>
-            <w:tcW w:w="8090" w:type="dxa"/>
-          </w:tcPr>
-          <w:p>
-            <w:r>
-              <w:t>Community centres can arrange these visits.</w:t>
-            </w:r>
-          </w:p>
         </w:tc>
       </w:tr>
       <w:tr>
@@ -1772,11 +1622,39 @@
     <w:p>
       <w:pPr>
         <w:spacing w:before="160" w:after="120"/>
+        <w:rPr>
+          <w:b/>
+        </w:rPr>
       </w:pPr>
       <w:r>
         <w:rPr>
           <w:b/>
         </w:rPr>
+        <w:br/>
+      </w:r>
+    </w:p>
+    <w:p>
+      <w:pPr>
+        <w:rPr>
+          <w:b/>
+        </w:rPr>
+      </w:pPr>
+      <w:r>
+        <w:rPr>
+          <w:b/>
+        </w:rPr>
+        <w:br w:type="page"/>
+      </w:r>
+    </w:p>
+    <w:p>
+      <w:pPr>
+        <w:spacing w:before="160" w:after="120" w:line="360" w:lineRule="auto"/>
+      </w:pPr>
+      <w:r>
+        <w:rPr>
+          <w:b/>
+        </w:rPr>
+        <w:lastRenderedPageBreak/>
         <w:t>PART E: WRITING PRACTICE</w:t>
       </w:r>
     </w:p>
@@ -1797,12 +1675,9 @@
             <w:shd w:val="clear" w:color="auto" w:fill="F2F2F2"/>
           </w:tcPr>
           <w:p>
-            <w:r>
-              <w:t>HKDSE Adapted Paper 2 Prompt:</w:t>
-            </w:r>
-          </w:p>
-          <w:p/>
-          <w:p>
+            <w:pPr>
+              <w:spacing w:line="360" w:lineRule="auto"/>
+            </w:pPr>
             <w:r>
               <w:t>A recent survey has found that young people in Hong Kong take far less exercise than they should, and the government is now inviting ideas on how to improve their physical well-being. Write a letter to the editor of the Hong Kong Young Post, suggesting ONE way in which our city can improve the physical well-being of its young people.</w:t>
             </w:r>
@@ -1812,7 +1687,7 @@
     </w:tbl>
     <w:p>
       <w:pPr>
-        <w:spacing w:before="160" w:after="80"/>
+        <w:spacing w:before="160" w:after="80" w:line="360" w:lineRule="auto"/>
       </w:pPr>
       <w:r>
         <w:rPr>
@@ -1823,13 +1698,10 @@
     </w:p>
     <w:p>
       <w:pPr>
-        <w:spacing w:after="0"/>
+        <w:spacing w:after="0" w:line="360" w:lineRule="auto"/>
       </w:pPr>
       <w:r>
-        <w:t>Make ONE suggestion (100 words)</w:t>
-      </w:r>
-      <w:r>
-        <w:t xml:space="preserve"> about improving physical </w:t>
+        <w:t xml:space="preserve">Make ONE suggestion (100 words) about improving physical </w:t>
       </w:r>
       <w:proofErr w:type="gramStart"/>
       <w:r>
@@ -1842,12 +1714,12 @@
     </w:p>
     <w:p>
       <w:pPr>
-        <w:spacing w:after="0"/>
+        <w:spacing w:after="0" w:line="360" w:lineRule="auto"/>
       </w:pPr>
     </w:p>
     <w:p>
       <w:pPr>
-        <w:spacing w:after="0"/>
+        <w:spacing w:after="0" w:line="360" w:lineRule="auto"/>
       </w:pPr>
       <w:r>
         <w:t>Follow the chain: [Topic sentence] → [Explain] → [Example / evidence] → [Round off].</w:t>
@@ -1855,17 +1727,12 @@
     </w:p>
     <w:p>
       <w:pPr>
-        <w:spacing w:after="0"/>
+        <w:spacing w:after="0" w:line="360" w:lineRule="auto"/>
       </w:pPr>
-      <w:r>
-        <w:rPr>
-          <w:b w:val="0"/>
-        </w:rPr>
-      </w:r>
     </w:p>
     <w:p>
       <w:pPr>
-        <w:spacing w:before="160" w:after="80"/>
+        <w:spacing w:before="160" w:after="80" w:line="360" w:lineRule="auto"/>
       </w:pPr>
       <w:r>
         <w:rPr>
@@ -1876,121 +1743,241 @@
     </w:p>
     <w:p>
       <w:pPr>
-        <w:spacing w:after="0"/>
+        <w:spacing w:after="0" w:line="480" w:lineRule="auto"/>
       </w:pPr>
       <w:r>
-        <w:rPr>
-          <w:b w:val="0"/>
-        </w:rPr>
-        <w:t>________________________________________________________________________________</w:t>
+        <w:t>__________________________________________________________</w:t>
+      </w:r>
+      <w:r>
+        <w:t>____________</w:t>
+      </w:r>
+      <w:r>
+        <w:t>______________________</w:t>
       </w:r>
     </w:p>
     <w:p>
       <w:pPr>
-        <w:spacing w:after="0"/>
+        <w:spacing w:after="0" w:line="480" w:lineRule="auto"/>
       </w:pPr>
       <w:r>
-        <w:rPr>
-          <w:b w:val="0"/>
-        </w:rPr>
-        <w:t>________________________________________________________________________________</w:t>
+        <w:t>____________________________________________________________________________________________</w:t>
       </w:r>
     </w:p>
     <w:p>
       <w:pPr>
-        <w:spacing w:after="0"/>
+        <w:spacing w:after="0" w:line="480" w:lineRule="auto"/>
       </w:pPr>
       <w:r>
-        <w:rPr>
-          <w:b w:val="0"/>
-        </w:rPr>
-        <w:t>________________________________________________________________________________</w:t>
+        <w:t>____________________________________________________________________________________________</w:t>
       </w:r>
     </w:p>
     <w:p>
       <w:pPr>
-        <w:spacing w:after="0"/>
+        <w:spacing w:after="0" w:line="480" w:lineRule="auto"/>
       </w:pPr>
       <w:r>
-        <w:rPr>
-          <w:b w:val="0"/>
-        </w:rPr>
-        <w:t>________________________________________________________________________________</w:t>
+        <w:t>____________________________________________________________________________________________</w:t>
       </w:r>
     </w:p>
     <w:p>
       <w:pPr>
-        <w:spacing w:after="0"/>
+        <w:spacing w:after="0" w:line="480" w:lineRule="auto"/>
       </w:pPr>
       <w:r>
-        <w:rPr>
-          <w:b w:val="0"/>
-        </w:rPr>
-        <w:t>________________________________________________________________________________</w:t>
+        <w:t>____________________________________________________________________________________________</w:t>
       </w:r>
     </w:p>
     <w:p>
       <w:pPr>
-        <w:spacing w:after="0"/>
+        <w:spacing w:after="0" w:line="480" w:lineRule="auto"/>
       </w:pPr>
       <w:r>
-        <w:rPr>
-          <w:b w:val="0"/>
-        </w:rPr>
-        <w:t>________________________________________________________________________________</w:t>
+        <w:t>____________________________________________________________________________________________</w:t>
       </w:r>
     </w:p>
     <w:p>
       <w:pPr>
-        <w:spacing w:after="0"/>
+        <w:spacing w:after="0" w:line="480" w:lineRule="auto"/>
       </w:pPr>
       <w:r>
-        <w:rPr>
-          <w:b w:val="0"/>
-        </w:rPr>
-        <w:t>________________________________________________________________________________</w:t>
+        <w:t>____________________________________________________________________________________________</w:t>
       </w:r>
     </w:p>
+    <w:sectPr>
+      <w:footerReference w:type="even" r:id="rId9"/>
+      <w:footerReference w:type="default" r:id="rId10"/>
+      <w:pgSz w:w="12240" w:h="15840"/>
+      <w:pgMar w:top="720" w:right="1008" w:bottom="720" w:left="1008" w:header="720" w:footer="720" w:gutter="0"/>
+      <w:cols w:space="720"/>
+      <w:docGrid w:linePitch="360"/>
+    </w:sectPr>
+  </w:body>
+</w:document>
+</file>
+
+<file path=word/endnotes.xml><?xml version="1.0" encoding="utf-8"?>
+<w:endnotes xmlns:wpc="http://schemas.microsoft.com/office/word/2010/wordprocessingCanvas" xmlns:cx="http://schemas.microsoft.com/office/drawing/2014/chartex" xmlns:cx1="http://schemas.microsoft.com/office/drawing/2015/9/8/chartex" xmlns:cx2="http://schemas.microsoft.com/office/drawing/2015/10/21/chartex" xmlns:cx3="http://schemas.microsoft.com/office/drawing/2016/5/9/chartex" xmlns:cx4="http://schemas.microsoft.com/office/drawing/2016/5/10/chartex" xmlns:cx5="http://schemas.microsoft.com/office/drawing/2016/5/11/chartex" xmlns:cx6="http://schemas.microsoft.com/office/drawing/2016/5/12/chartex" xmlns:cx7="http://schemas.microsoft.com/office/drawing/2016/5/13/chartex" xmlns:cx8="http://schemas.microsoft.com/office/drawing/2016/5/14/chartex" xmlns:mc="http://schemas.openxmlformats.org/markup-compatibility/2006" xmlns:aink="http://schemas.microsoft.com/office/drawing/2016/ink" xmlns:am3d="http://schemas.microsoft.com/office/drawing/2017/model3d" xmlns:o="urn:schemas-microsoft-com:office:office" xmlns:oel="http://schemas.microsoft.com/office/2019/extlst" xmlns:r="http://schemas.openxmlformats.org/officeDocument/2006/relationships" xmlns:m="http://schemas.openxmlformats.org/officeDocument/2006/math" xmlns:v="urn:schemas-microsoft-com:vml" xmlns:wp14="http://schemas.microsoft.com/office/word/2010/wordprocessingDrawing" xmlns:wp="http://schemas.openxmlformats.org/drawingml/2006/wordprocessingDrawing" xmlns:w10="urn:schemas-microsoft-com:office:word" xmlns:w="http://schemas.openxmlformats.org/wordprocessingml/2006/main" xmlns:w14="http://schemas.microsoft.com/office/word/2010/wordml" xmlns:w15="http://schemas.microsoft.com/office/word/2012/wordml" xmlns:w16cex="http://schemas.microsoft.com/office/word/2018/wordml/cex" xmlns:w16cid="http://schemas.microsoft.com/office/word/2016/wordml/cid" xmlns:w16="http://schemas.microsoft.com/office/word/2018/wordml" xmlns:w16du="http://schemas.microsoft.com/office/word/2023/wordml/word16du" xmlns:w16sdtdh="http://schemas.microsoft.com/office/word/2020/wordml/sdtdatahash" xmlns:w16sdtfl="http://schemas.microsoft.com/office/word/2024/wordml/sdtformatlock" xmlns:w16se="http://schemas.microsoft.com/office/word/2015/wordml/symex" xmlns:wpg="http://schemas.microsoft.com/office/word/2010/wordprocessingGroup" xmlns:wpi="http://schemas.microsoft.com/office/word/2010/wordprocessingInk" xmlns:wne="http://schemas.microsoft.com/office/word/2006/wordml" xmlns:wps="http://schemas.microsoft.com/office/word/2010/wordprocessingShape" mc:Ignorable="w14 w15 w16se w16cid w16 w16cex w16sdtdh w16sdtfl w16du wp14">
+  <w:endnote w:type="separator" w:id="-1">
     <w:p>
       <w:pPr>
-        <w:spacing w:after="0"/>
+        <w:spacing w:after="0" w:line="240" w:lineRule="auto"/>
       </w:pPr>
       <w:r>
-        <w:rPr>
-          <w:b w:val="0"/>
-        </w:rPr>
-        <w:t>________________________________________________________________________________</w:t>
+        <w:separator/>
       </w:r>
     </w:p>
+  </w:endnote>
+  <w:endnote w:type="continuationSeparator" w:id="0">
     <w:p>
       <w:pPr>
-        <w:spacing w:after="0"/>
+        <w:spacing w:after="0" w:line="240" w:lineRule="auto"/>
       </w:pPr>
       <w:r>
-        <w:rPr>
-          <w:b w:val="0"/>
-        </w:rPr>
-        <w:t>________________________________________________________________________________</w:t>
+        <w:continuationSeparator/>
       </w:r>
     </w:p>
+  </w:endnote>
+</w:endnotes>
+</file>
+
+<file path=word/footer1.xml><?xml version="1.0" encoding="utf-8"?>
+<w:ftr xmlns:wpc="http://schemas.microsoft.com/office/word/2010/wordprocessingCanvas" xmlns:cx="http://schemas.microsoft.com/office/drawing/2014/chartex" xmlns:cx1="http://schemas.microsoft.com/office/drawing/2015/9/8/chartex" xmlns:cx2="http://schemas.microsoft.com/office/drawing/2015/10/21/chartex" xmlns:cx3="http://schemas.microsoft.com/office/drawing/2016/5/9/chartex" xmlns:cx4="http://schemas.microsoft.com/office/drawing/2016/5/10/chartex" xmlns:cx5="http://schemas.microsoft.com/office/drawing/2016/5/11/chartex" xmlns:cx6="http://schemas.microsoft.com/office/drawing/2016/5/12/chartex" xmlns:cx7="http://schemas.microsoft.com/office/drawing/2016/5/13/chartex" xmlns:cx8="http://schemas.microsoft.com/office/drawing/2016/5/14/chartex" xmlns:mc="http://schemas.openxmlformats.org/markup-compatibility/2006" xmlns:aink="http://schemas.microsoft.com/office/drawing/2016/ink" xmlns:am3d="http://schemas.microsoft.com/office/drawing/2017/model3d" xmlns:o="urn:schemas-microsoft-com:office:office" xmlns:oel="http://schemas.microsoft.com/office/2019/extlst" xmlns:r="http://schemas.openxmlformats.org/officeDocument/2006/relationships" xmlns:m="http://schemas.openxmlformats.org/officeDocument/2006/math" xmlns:v="urn:schemas-microsoft-com:vml" xmlns:wp14="http://schemas.microsoft.com/office/word/2010/wordprocessingDrawing" xmlns:wp="http://schemas.openxmlformats.org/drawingml/2006/wordprocessingDrawing" xmlns:w10="urn:schemas-microsoft-com:office:word" xmlns:w="http://schemas.openxmlformats.org/wordprocessingml/2006/main" xmlns:w14="http://schemas.microsoft.com/office/word/2010/wordml" xmlns:w15="http://schemas.microsoft.com/office/word/2012/wordml" xmlns:w16cex="http://schemas.microsoft.com/office/word/2018/wordml/cex" xmlns:w16cid="http://schemas.microsoft.com/office/word/2016/wordml/cid" xmlns:w16="http://schemas.microsoft.com/office/word/2018/wordml" xmlns:w16du="http://schemas.microsoft.com/office/word/2023/wordml/word16du" xmlns:w16sdtdh="http://schemas.microsoft.com/office/word/2020/wordml/sdtdatahash" xmlns:w16sdtfl="http://schemas.microsoft.com/office/word/2024/wordml/sdtformatlock" xmlns:w16se="http://schemas.microsoft.com/office/word/2015/wordml/symex" xmlns:wpg="http://schemas.microsoft.com/office/word/2010/wordprocessingGroup" xmlns:wpi="http://schemas.microsoft.com/office/word/2010/wordprocessingInk" xmlns:wne="http://schemas.microsoft.com/office/word/2006/wordml" xmlns:wps="http://schemas.microsoft.com/office/word/2010/wordprocessingShape" mc:Ignorable="w14 w15 w16se w16cid w16 w16cex w16sdtdh w16sdtfl w16du wp14">
+  <w:sdt>
+    <w:sdtPr>
+      <w:rPr>
+        <w:rStyle w:val="PageNumber"/>
+      </w:rPr>
+      <w:id w:val="224035689"/>
+      <w:docPartObj>
+        <w:docPartGallery w:val="Page Numbers (Bottom of Page)"/>
+        <w:docPartUnique/>
+      </w:docPartObj>
+    </w:sdtPr>
+    <w:sdtContent>
+      <w:p>
+        <w:pPr>
+          <w:pStyle w:val="Footer"/>
+          <w:framePr w:wrap="none" w:vAnchor="text" w:hAnchor="margin" w:xAlign="center" w:y="1"/>
+          <w:rPr>
+            <w:rStyle w:val="PageNumber"/>
+          </w:rPr>
+        </w:pPr>
+        <w:r>
+          <w:rPr>
+            <w:rStyle w:val="PageNumber"/>
+          </w:rPr>
+          <w:fldChar w:fldCharType="begin"/>
+        </w:r>
+        <w:r>
+          <w:rPr>
+            <w:rStyle w:val="PageNumber"/>
+          </w:rPr>
+          <w:instrText xml:space="preserve"> PAGE </w:instrText>
+        </w:r>
+        <w:r>
+          <w:rPr>
+            <w:rStyle w:val="PageNumber"/>
+          </w:rPr>
+          <w:fldChar w:fldCharType="end"/>
+        </w:r>
+      </w:p>
+    </w:sdtContent>
+  </w:sdt>
+  <w:p>
+    <w:pPr>
+      <w:pStyle w:val="Footer"/>
+    </w:pPr>
+  </w:p>
+</w:ftr>
+</file>
+
+<file path=word/footer2.xml><?xml version="1.0" encoding="utf-8"?>
+<w:ftr xmlns:wpc="http://schemas.microsoft.com/office/word/2010/wordprocessingCanvas" xmlns:cx="http://schemas.microsoft.com/office/drawing/2014/chartex" xmlns:cx1="http://schemas.microsoft.com/office/drawing/2015/9/8/chartex" xmlns:cx2="http://schemas.microsoft.com/office/drawing/2015/10/21/chartex" xmlns:cx3="http://schemas.microsoft.com/office/drawing/2016/5/9/chartex" xmlns:cx4="http://schemas.microsoft.com/office/drawing/2016/5/10/chartex" xmlns:cx5="http://schemas.microsoft.com/office/drawing/2016/5/11/chartex" xmlns:cx6="http://schemas.microsoft.com/office/drawing/2016/5/12/chartex" xmlns:cx7="http://schemas.microsoft.com/office/drawing/2016/5/13/chartex" xmlns:cx8="http://schemas.microsoft.com/office/drawing/2016/5/14/chartex" xmlns:mc="http://schemas.openxmlformats.org/markup-compatibility/2006" xmlns:aink="http://schemas.microsoft.com/office/drawing/2016/ink" xmlns:am3d="http://schemas.microsoft.com/office/drawing/2017/model3d" xmlns:o="urn:schemas-microsoft-com:office:office" xmlns:oel="http://schemas.microsoft.com/office/2019/extlst" xmlns:r="http://schemas.openxmlformats.org/officeDocument/2006/relationships" xmlns:m="http://schemas.openxmlformats.org/officeDocument/2006/math" xmlns:v="urn:schemas-microsoft-com:vml" xmlns:wp14="http://schemas.microsoft.com/office/word/2010/wordprocessingDrawing" xmlns:wp="http://schemas.openxmlformats.org/drawingml/2006/wordprocessingDrawing" xmlns:w10="urn:schemas-microsoft-com:office:word" xmlns:w="http://schemas.openxmlformats.org/wordprocessingml/2006/main" xmlns:w14="http://schemas.microsoft.com/office/word/2010/wordml" xmlns:w15="http://schemas.microsoft.com/office/word/2012/wordml" xmlns:w16cex="http://schemas.microsoft.com/office/word/2018/wordml/cex" xmlns:w16cid="http://schemas.microsoft.com/office/word/2016/wordml/cid" xmlns:w16="http://schemas.microsoft.com/office/word/2018/wordml" xmlns:w16du="http://schemas.microsoft.com/office/word/2023/wordml/word16du" xmlns:w16sdtdh="http://schemas.microsoft.com/office/word/2020/wordml/sdtdatahash" xmlns:w16sdtfl="http://schemas.microsoft.com/office/word/2024/wordml/sdtformatlock" xmlns:w16se="http://schemas.microsoft.com/office/word/2015/wordml/symex" xmlns:wpg="http://schemas.microsoft.com/office/word/2010/wordprocessingGroup" xmlns:wpi="http://schemas.microsoft.com/office/word/2010/wordprocessingInk" xmlns:wne="http://schemas.microsoft.com/office/word/2006/wordml" xmlns:wps="http://schemas.microsoft.com/office/word/2010/wordprocessingShape" mc:Ignorable="w14 w15 w16se w16cid w16 w16cex w16sdtdh w16sdtfl w16du wp14">
+  <w:sdt>
+    <w:sdtPr>
+      <w:rPr>
+        <w:rStyle w:val="PageNumber"/>
+      </w:rPr>
+      <w:id w:val="-2034942477"/>
+      <w:docPartObj>
+        <w:docPartGallery w:val="Page Numbers (Bottom of Page)"/>
+        <w:docPartUnique/>
+      </w:docPartObj>
+    </w:sdtPr>
+    <w:sdtContent>
+      <w:p>
+        <w:pPr>
+          <w:pStyle w:val="Footer"/>
+          <w:framePr w:wrap="none" w:vAnchor="text" w:hAnchor="margin" w:xAlign="center" w:y="1"/>
+          <w:rPr>
+            <w:rStyle w:val="PageNumber"/>
+          </w:rPr>
+        </w:pPr>
+        <w:r>
+          <w:rPr>
+            <w:rStyle w:val="PageNumber"/>
+          </w:rPr>
+          <w:fldChar w:fldCharType="begin"/>
+        </w:r>
+        <w:r>
+          <w:rPr>
+            <w:rStyle w:val="PageNumber"/>
+          </w:rPr>
+          <w:instrText xml:space="preserve"> PAGE </w:instrText>
+        </w:r>
+        <w:r>
+          <w:rPr>
+            <w:rStyle w:val="PageNumber"/>
+          </w:rPr>
+          <w:fldChar w:fldCharType="separate"/>
+        </w:r>
+        <w:r>
+          <w:rPr>
+            <w:rStyle w:val="PageNumber"/>
+            <w:noProof/>
+          </w:rPr>
+          <w:t>1</w:t>
+        </w:r>
+        <w:r>
+          <w:rPr>
+            <w:rStyle w:val="PageNumber"/>
+          </w:rPr>
+          <w:fldChar w:fldCharType="end"/>
+        </w:r>
+      </w:p>
+    </w:sdtContent>
+  </w:sdt>
+  <w:p>
+    <w:pPr>
+      <w:pStyle w:val="Footer"/>
+    </w:pPr>
+  </w:p>
+</w:ftr>
+</file>
+
+<file path=word/footnotes.xml><?xml version="1.0" encoding="utf-8"?>
+<w:footnotes xmlns:wpc="http://schemas.microsoft.com/office/word/2010/wordprocessingCanvas" xmlns:cx="http://schemas.microsoft.com/office/drawing/2014/chartex" xmlns:cx1="http://schemas.microsoft.com/office/drawing/2015/9/8/chartex" xmlns:cx2="http://schemas.microsoft.com/office/drawing/2015/10/21/chartex" xmlns:cx3="http://schemas.microsoft.com/office/drawing/2016/5/9/chartex" xmlns:cx4="http://schemas.microsoft.com/office/drawing/2016/5/10/chartex" xmlns:cx5="http://schemas.microsoft.com/office/drawing/2016/5/11/chartex" xmlns:cx6="http://schemas.microsoft.com/office/drawing/2016/5/12/chartex" xmlns:cx7="http://schemas.microsoft.com/office/drawing/2016/5/13/chartex" xmlns:cx8="http://schemas.microsoft.com/office/drawing/2016/5/14/chartex" xmlns:mc="http://schemas.openxmlformats.org/markup-compatibility/2006" xmlns:aink="http://schemas.microsoft.com/office/drawing/2016/ink" xmlns:am3d="http://schemas.microsoft.com/office/drawing/2017/model3d" xmlns:o="urn:schemas-microsoft-com:office:office" xmlns:oel="http://schemas.microsoft.com/office/2019/extlst" xmlns:r="http://schemas.openxmlformats.org/officeDocument/2006/relationships" xmlns:m="http://schemas.openxmlformats.org/officeDocument/2006/math" xmlns:v="urn:schemas-microsoft-com:vml" xmlns:wp14="http://schemas.microsoft.com/office/word/2010/wordprocessingDrawing" xmlns:wp="http://schemas.openxmlformats.org/drawingml/2006/wordprocessingDrawing" xmlns:w10="urn:schemas-microsoft-com:office:word" xmlns:w="http://schemas.openxmlformats.org/wordprocessingml/2006/main" xmlns:w14="http://schemas.microsoft.com/office/word/2010/wordml" xmlns:w15="http://schemas.microsoft.com/office/word/2012/wordml" xmlns:w16cex="http://schemas.microsoft.com/office/word/2018/wordml/cex" xmlns:w16cid="http://schemas.microsoft.com/office/word/2016/wordml/cid" xmlns:w16="http://schemas.microsoft.com/office/word/2018/wordml" xmlns:w16du="http://schemas.microsoft.com/office/word/2023/wordml/word16du" xmlns:w16sdtdh="http://schemas.microsoft.com/office/word/2020/wordml/sdtdatahash" xmlns:w16sdtfl="http://schemas.microsoft.com/office/word/2024/wordml/sdtformatlock" xmlns:w16se="http://schemas.microsoft.com/office/word/2015/wordml/symex" xmlns:wpg="http://schemas.microsoft.com/office/word/2010/wordprocessingGroup" xmlns:wpi="http://schemas.microsoft.com/office/word/2010/wordprocessingInk" xmlns:wne="http://schemas.microsoft.com/office/word/2006/wordml" xmlns:wps="http://schemas.microsoft.com/office/word/2010/wordprocessingShape" mc:Ignorable="w14 w15 w16se w16cid w16 w16cex w16sdtdh w16sdtfl w16du wp14">
+  <w:footnote w:type="separator" w:id="-1">
     <w:p>
       <w:pPr>
-        <w:spacing w:after="0"/>
+        <w:spacing w:after="0" w:line="240" w:lineRule="auto"/>
       </w:pPr>
       <w:r>
-        <w:rPr>
-          <w:b w:val="0"/>
-        </w:rPr>
-        <w:t>________________________________________________________________________________</w:t>
+        <w:separator/>
       </w:r>
     </w:p>
+  </w:footnote>
+  <w:footnote w:type="continuationSeparator" w:id="0">
     <w:p>
       <w:pPr>
-        <w:spacing w:after="0"/>
+        <w:spacing w:after="0" w:line="240" w:lineRule="auto"/>
       </w:pPr>
+      <w:r>
+        <w:continuationSeparator/>
+      </w:r>
     </w:p>
-  </w:body>
-</w:document>
+  </w:footnote>
+</w:footnotes>
 </file>
 
 <file path=word/numbering.xml><?xml version="1.0" encoding="utf-8"?>
@@ -13579,6 +13566,14 @@
       </w:tcPr>
     </w:tblStylePr>
   </w:style>
+  <w:style w:type="character" w:styleId="PageNumber">
+    <w:name w:val="page number"/>
+    <w:basedOn w:val="DefaultParagraphFont"/>
+    <w:uiPriority w:val="99"/>
+    <w:semiHidden/>
+    <w:unhideWhenUsed/>
+    <w:rsid w:val="00955C0E"/>
+  </w:style>
 </w:styles>
 </file>
 

</xml_diff>